<commit_message>
Completed the report on Lr3
</commit_message>
<xml_diff>
--- a/Lr3/Lr3/ИиКТ_25_ПОз_Седов_Денис_Владимирович_ЛР_3.docx
+++ b/Lr3/Lr3/ИиКТ_25_ПОз_Седов_Денис_Владимирович_ЛР_3.docx
@@ -458,7 +458,6 @@
         <w:t xml:space="preserve">(фамилия, </w:t>
       </w:r>
       <w:proofErr w:type="spellStart"/>
-      <w:proofErr w:type="gramStart"/>
       <w:r>
         <w:rPr>
           <w:rFonts w:ascii="Times New Roman" w:hAnsi="Times New Roman"/>
@@ -476,9 +475,73 @@
           <w:sz w:val="20"/>
           <w:szCs w:val="20"/>
         </w:rPr>
-        <w:t>.</w:t>
-      </w:r>
-      <w:proofErr w:type="gramEnd"/>
+        <w:t>.)</w:t>
+      </w:r>
+    </w:p>
+    <w:p>
+      <w:pPr>
+        <w:ind w:left="4678"/>
+        <w:rPr>
+          <w:rFonts w:ascii="Times New Roman" w:hAnsi="Times New Roman"/>
+          <w:sz w:val="8"/>
+          <w:szCs w:val="8"/>
+        </w:rPr>
+      </w:pPr>
+    </w:p>
+    <w:p>
+      <w:pPr>
+        <w:ind w:left="4678"/>
+        <w:outlineLvl w:val="0"/>
+        <w:rPr>
+          <w:rFonts w:ascii="Times New Roman" w:hAnsi="Times New Roman"/>
+        </w:rPr>
+      </w:pPr>
+      <w:r>
+        <w:rPr>
+          <w:rFonts w:ascii="Times New Roman" w:hAnsi="Times New Roman"/>
+        </w:rPr>
+        <w:t>СТУДЕНТ:</w:t>
+      </w:r>
+    </w:p>
+    <w:p>
+      <w:pPr>
+        <w:spacing w:after="0" w:line="240" w:lineRule="auto"/>
+        <w:ind w:left="4678"/>
+        <w:rPr>
+          <w:rFonts w:ascii="Times New Roman" w:hAnsi="Times New Roman"/>
+        </w:rPr>
+      </w:pPr>
+      <w:r>
+        <w:rPr>
+          <w:rFonts w:ascii="Times New Roman" w:hAnsi="Times New Roman"/>
+        </w:rPr>
+        <w:t>________________            ______</w:t>
+      </w:r>
+      <w:r>
+        <w:rPr>
+          <w:rFonts w:ascii="Times New Roman" w:hAnsi="Times New Roman"/>
+          <w:u w:val="single"/>
+        </w:rPr>
+        <w:t>Седов Д.В.</w:t>
+      </w:r>
+      <w:r>
+        <w:rPr>
+          <w:rFonts w:ascii="Times New Roman" w:hAnsi="Times New Roman"/>
+        </w:rPr>
+        <w:t>_____</w:t>
+      </w:r>
+    </w:p>
+    <w:p>
+      <w:pPr>
+        <w:spacing w:after="0" w:line="240" w:lineRule="auto"/>
+        <w:ind w:left="4678" w:firstLine="278"/>
+        <w:rPr>
+          <w:rFonts w:ascii="Times New Roman" w:hAnsi="Times New Roman"/>
+          <w:color w:val="7F7F7F"/>
+          <w:sz w:val="36"/>
+          <w:szCs w:val="36"/>
+        </w:rPr>
+      </w:pPr>
       <w:r>
         <w:rPr>
           <w:rFonts w:ascii="Times New Roman" w:hAnsi="Times New Roman"/>
@@ -486,72 +549,87 @@
           <w:sz w:val="20"/>
           <w:szCs w:val="20"/>
         </w:rPr>
-        <w:t>)</w:t>
-      </w:r>
-    </w:p>
-    <w:p>
-      <w:pPr>
-        <w:ind w:left="4678"/>
-        <w:rPr>
-          <w:rFonts w:ascii="Times New Roman" w:hAnsi="Times New Roman"/>
-          <w:sz w:val="8"/>
-          <w:szCs w:val="8"/>
-        </w:rPr>
-      </w:pPr>
-    </w:p>
-    <w:p>
-      <w:pPr>
-        <w:ind w:left="4678"/>
-        <w:outlineLvl w:val="0"/>
-        <w:rPr>
-          <w:rFonts w:ascii="Times New Roman" w:hAnsi="Times New Roman"/>
-        </w:rPr>
-      </w:pPr>
-      <w:r>
-        <w:rPr>
-          <w:rFonts w:ascii="Times New Roman" w:hAnsi="Times New Roman"/>
-        </w:rPr>
-        <w:t>СТУДЕНТ:</w:t>
-      </w:r>
-    </w:p>
-    <w:p>
-      <w:pPr>
-        <w:spacing w:after="0" w:line="240" w:lineRule="auto"/>
-        <w:ind w:left="4678"/>
-        <w:rPr>
-          <w:rFonts w:ascii="Times New Roman" w:hAnsi="Times New Roman"/>
-        </w:rPr>
-      </w:pPr>
-      <w:r>
-        <w:rPr>
-          <w:rFonts w:ascii="Times New Roman" w:hAnsi="Times New Roman"/>
-        </w:rPr>
-        <w:t>________________            ______</w:t>
-      </w:r>
-      <w:r>
-        <w:rPr>
-          <w:rFonts w:ascii="Times New Roman" w:hAnsi="Times New Roman"/>
-          <w:u w:val="single"/>
-        </w:rPr>
-        <w:t>Седов Д.В.</w:t>
-      </w:r>
-      <w:r>
-        <w:rPr>
-          <w:rFonts w:ascii="Times New Roman" w:hAnsi="Times New Roman"/>
-        </w:rPr>
-        <w:t>_____</w:t>
-      </w:r>
-    </w:p>
-    <w:p>
-      <w:pPr>
-        <w:spacing w:after="0" w:line="240" w:lineRule="auto"/>
-        <w:ind w:left="4678" w:firstLine="278"/>
+        <w:t>(подпись)</w:t>
+      </w:r>
+      <w:r>
+        <w:rPr>
+          <w:rFonts w:ascii="Times New Roman" w:hAnsi="Times New Roman"/>
+          <w:color w:val="7F7F7F"/>
+          <w:sz w:val="20"/>
+          <w:szCs w:val="20"/>
+        </w:rPr>
+        <w:tab/>
+      </w:r>
+      <w:r>
+        <w:rPr>
+          <w:rFonts w:ascii="Times New Roman" w:hAnsi="Times New Roman"/>
+          <w:color w:val="7F7F7F"/>
+          <w:sz w:val="20"/>
+          <w:szCs w:val="20"/>
+        </w:rPr>
+        <w:tab/>
+      </w:r>
+      <w:r>
+        <w:rPr>
+          <w:rFonts w:ascii="Times New Roman" w:hAnsi="Times New Roman"/>
+          <w:color w:val="7F7F7F"/>
+          <w:sz w:val="20"/>
+          <w:szCs w:val="20"/>
+        </w:rPr>
+        <w:tab/>
+        <w:t xml:space="preserve">(фамилия, </w:t>
+      </w:r>
+      <w:proofErr w:type="spellStart"/>
+      <w:r>
+        <w:rPr>
+          <w:rFonts w:ascii="Times New Roman" w:hAnsi="Times New Roman"/>
+          <w:color w:val="7F7F7F"/>
+          <w:sz w:val="20"/>
+          <w:szCs w:val="20"/>
+        </w:rPr>
+        <w:t>и.,о</w:t>
+      </w:r>
+      <w:proofErr w:type="spellEnd"/>
+      <w:r>
+        <w:rPr>
+          <w:rFonts w:ascii="Times New Roman" w:hAnsi="Times New Roman"/>
+          <w:color w:val="7F7F7F"/>
+          <w:sz w:val="20"/>
+          <w:szCs w:val="20"/>
+        </w:rPr>
+        <w:t xml:space="preserve">.) </w:t>
+      </w:r>
+      <w:r>
         <w:rPr>
           <w:rFonts w:ascii="Times New Roman" w:hAnsi="Times New Roman"/>
           <w:color w:val="7F7F7F"/>
           <w:sz w:val="36"/>
           <w:szCs w:val="36"/>
         </w:rPr>
+        <w:t xml:space="preserve"> </w:t>
+      </w:r>
+    </w:p>
+    <w:p>
+      <w:pPr>
+        <w:spacing w:after="0" w:line="240" w:lineRule="auto"/>
+        <w:ind w:left="4678" w:firstLine="278"/>
+        <w:rPr>
+          <w:rFonts w:ascii="Times New Roman" w:hAnsi="Times New Roman"/>
+          <w:color w:val="7F7F7F"/>
+          <w:sz w:val="16"/>
+          <w:szCs w:val="16"/>
+        </w:rPr>
+      </w:pPr>
+    </w:p>
+    <w:p>
+      <w:pPr>
+        <w:spacing w:after="0" w:line="240" w:lineRule="auto"/>
+        <w:ind w:left="4678"/>
+        <w:rPr>
+          <w:rFonts w:ascii="Times New Roman" w:hAnsi="Times New Roman"/>
+          <w:sz w:val="20"/>
+          <w:szCs w:val="20"/>
+        </w:rPr>
       </w:pPr>
       <w:r>
         <w:rPr>
@@ -560,7 +638,7 @@
           <w:sz w:val="20"/>
           <w:szCs w:val="20"/>
         </w:rPr>
-        <w:t>(подпись)</w:t>
+        <w:tab/>
       </w:r>
       <w:r>
         <w:rPr>
@@ -588,20 +666,44 @@
           <w:szCs w:val="20"/>
         </w:rPr>
         <w:tab/>
-        <w:t xml:space="preserve">(фамилия, </w:t>
-      </w:r>
-      <w:proofErr w:type="spellStart"/>
-      <w:proofErr w:type="gramStart"/>
-      <w:r>
+      </w:r>
+      <w:r>
+        <w:rPr>
+          <w:rFonts w:ascii="Times New Roman" w:hAnsi="Times New Roman"/>
+          <w:sz w:val="20"/>
+          <w:szCs w:val="20"/>
+        </w:rPr>
+        <w:t xml:space="preserve"> _______</w:t>
+      </w:r>
+      <w:r>
+        <w:rPr>
+          <w:rFonts w:ascii="Times New Roman" w:hAnsi="Times New Roman"/>
+          <w:sz w:val="20"/>
+          <w:szCs w:val="20"/>
+          <w:u w:val="single"/>
+        </w:rPr>
+        <w:t>25-ПОз</w:t>
+      </w:r>
+      <w:r>
+        <w:rPr>
+          <w:rFonts w:ascii="Times New Roman" w:hAnsi="Times New Roman"/>
+          <w:sz w:val="20"/>
+          <w:szCs w:val="20"/>
+        </w:rPr>
+        <w:t>________</w:t>
+      </w:r>
+    </w:p>
+    <w:p>
+      <w:pPr>
+        <w:spacing w:after="0" w:line="240" w:lineRule="auto"/>
+        <w:ind w:left="4678"/>
         <w:rPr>
           <w:rFonts w:ascii="Times New Roman" w:hAnsi="Times New Roman"/>
           <w:color w:val="7F7F7F"/>
           <w:sz w:val="20"/>
           <w:szCs w:val="20"/>
         </w:rPr>
-        <w:t>и.,о</w:t>
-      </w:r>
-      <w:proofErr w:type="spellEnd"/>
+      </w:pPr>
       <w:r>
         <w:rPr>
           <w:rFonts w:ascii="Times New Roman" w:hAnsi="Times New Roman"/>
@@ -609,9 +711,8 @@
           <w:sz w:val="20"/>
           <w:szCs w:val="20"/>
         </w:rPr>
-        <w:t>.</w:t>
-      </w:r>
-      <w:proofErr w:type="gramEnd"/>
+        <w:tab/>
+      </w:r>
       <w:r>
         <w:rPr>
           <w:rFonts w:ascii="Times New Roman" w:hAnsi="Times New Roman"/>
@@ -619,40 +720,8 @@
           <w:sz w:val="20"/>
           <w:szCs w:val="20"/>
         </w:rPr>
-        <w:t xml:space="preserve">) </w:t>
-      </w:r>
-      <w:r>
-        <w:rPr>
-          <w:rFonts w:ascii="Times New Roman" w:hAnsi="Times New Roman"/>
-          <w:color w:val="7F7F7F"/>
-          <w:sz w:val="36"/>
-          <w:szCs w:val="36"/>
-        </w:rPr>
-        <w:t xml:space="preserve"> </w:t>
-      </w:r>
-    </w:p>
-    <w:p>
-      <w:pPr>
-        <w:spacing w:after="0" w:line="240" w:lineRule="auto"/>
-        <w:ind w:left="4678" w:firstLine="278"/>
-        <w:rPr>
-          <w:rFonts w:ascii="Times New Roman" w:hAnsi="Times New Roman"/>
-          <w:color w:val="7F7F7F"/>
-          <w:sz w:val="16"/>
-          <w:szCs w:val="16"/>
-        </w:rPr>
-      </w:pPr>
-    </w:p>
-    <w:p>
-      <w:pPr>
-        <w:spacing w:after="0" w:line="240" w:lineRule="auto"/>
-        <w:ind w:left="4678"/>
-        <w:rPr>
-          <w:rFonts w:ascii="Times New Roman" w:hAnsi="Times New Roman"/>
-          <w:sz w:val="20"/>
-          <w:szCs w:val="20"/>
-        </w:rPr>
-      </w:pPr>
+        <w:tab/>
+      </w:r>
       <w:r>
         <w:rPr>
           <w:rFonts w:ascii="Times New Roman" w:hAnsi="Times New Roman"/>
@@ -679,97 +748,6 @@
           <w:szCs w:val="20"/>
         </w:rPr>
         <w:tab/>
-      </w:r>
-      <w:r>
-        <w:rPr>
-          <w:rFonts w:ascii="Times New Roman" w:hAnsi="Times New Roman"/>
-          <w:color w:val="7F7F7F"/>
-          <w:sz w:val="20"/>
-          <w:szCs w:val="20"/>
-        </w:rPr>
-        <w:tab/>
-      </w:r>
-      <w:r>
-        <w:rPr>
-          <w:rFonts w:ascii="Times New Roman" w:hAnsi="Times New Roman"/>
-          <w:sz w:val="20"/>
-          <w:szCs w:val="20"/>
-        </w:rPr>
-        <w:t xml:space="preserve"> _______</w:t>
-      </w:r>
-      <w:r>
-        <w:rPr>
-          <w:rFonts w:ascii="Times New Roman" w:hAnsi="Times New Roman"/>
-          <w:sz w:val="20"/>
-          <w:szCs w:val="20"/>
-          <w:u w:val="single"/>
-        </w:rPr>
-        <w:t>25-ПОз</w:t>
-      </w:r>
-      <w:r>
-        <w:rPr>
-          <w:rFonts w:ascii="Times New Roman" w:hAnsi="Times New Roman"/>
-          <w:sz w:val="20"/>
-          <w:szCs w:val="20"/>
-        </w:rPr>
-        <w:t>________</w:t>
-      </w:r>
-    </w:p>
-    <w:p>
-      <w:pPr>
-        <w:spacing w:after="0" w:line="240" w:lineRule="auto"/>
-        <w:ind w:left="4678"/>
-        <w:rPr>
-          <w:rFonts w:ascii="Times New Roman" w:hAnsi="Times New Roman"/>
-          <w:color w:val="7F7F7F"/>
-          <w:sz w:val="20"/>
-          <w:szCs w:val="20"/>
-        </w:rPr>
-      </w:pPr>
-      <w:r>
-        <w:rPr>
-          <w:rFonts w:ascii="Times New Roman" w:hAnsi="Times New Roman"/>
-          <w:color w:val="7F7F7F"/>
-          <w:sz w:val="20"/>
-          <w:szCs w:val="20"/>
-        </w:rPr>
-        <w:tab/>
-      </w:r>
-      <w:r>
-        <w:rPr>
-          <w:rFonts w:ascii="Times New Roman" w:hAnsi="Times New Roman"/>
-          <w:color w:val="7F7F7F"/>
-          <w:sz w:val="20"/>
-          <w:szCs w:val="20"/>
-        </w:rPr>
-        <w:tab/>
-      </w:r>
-      <w:r>
-        <w:rPr>
-          <w:rFonts w:ascii="Times New Roman" w:hAnsi="Times New Roman"/>
-          <w:color w:val="7F7F7F"/>
-          <w:sz w:val="20"/>
-          <w:szCs w:val="20"/>
-        </w:rPr>
-        <w:tab/>
-      </w:r>
-      <w:r>
-        <w:rPr>
-          <w:rFonts w:ascii="Times New Roman" w:hAnsi="Times New Roman"/>
-          <w:color w:val="7F7F7F"/>
-          <w:sz w:val="20"/>
-          <w:szCs w:val="20"/>
-        </w:rPr>
-        <w:tab/>
-      </w:r>
-      <w:r>
-        <w:rPr>
-          <w:rFonts w:ascii="Times New Roman" w:hAnsi="Times New Roman"/>
-          <w:color w:val="7F7F7F"/>
-          <w:sz w:val="20"/>
-          <w:szCs w:val="20"/>
-        </w:rPr>
-        <w:tab/>
         <w:t>(шифр группы)</w:t>
       </w:r>
     </w:p>
@@ -1007,6 +985,97 @@
           <w:szCs w:val="24"/>
         </w:rPr>
         <w:t xml:space="preserve">Ход работы: </w:t>
+      </w:r>
+    </w:p>
+    <w:p>
+      <w:pPr>
+        <w:pStyle w:val="a7"/>
+        <w:numPr>
+          <w:ilvl w:val="0"/>
+          <w:numId w:val="7"/>
+        </w:numPr>
+        <w:spacing w:line="240" w:lineRule="auto"/>
+        <w:rPr>
+          <w:rFonts w:ascii="Times New Roman" w:hAnsi="Times New Roman" w:cs="Times New Roman"/>
+          <w:bCs/>
+          <w:iCs/>
+          <w:color w:val="000000"/>
+          <w:sz w:val="24"/>
+          <w:szCs w:val="24"/>
+        </w:rPr>
+      </w:pPr>
+      <w:r>
+        <w:rPr>
+          <w:rFonts w:ascii="Times New Roman" w:hAnsi="Times New Roman" w:cs="Times New Roman"/>
+          <w:bCs/>
+          <w:iCs/>
+          <w:color w:val="000000"/>
+          <w:sz w:val="24"/>
+          <w:szCs w:val="24"/>
+        </w:rPr>
+        <w:t>Создание копии исходного репозитория:</w:t>
+      </w:r>
+    </w:p>
+    <w:p>
+      <w:pPr>
+        <w:pStyle w:val="a7"/>
+        <w:spacing w:line="240" w:lineRule="auto"/>
+        <w:ind w:left="-207"/>
+        <w:jc w:val="center"/>
+        <w:rPr>
+          <w:rFonts w:ascii="Times New Roman" w:hAnsi="Times New Roman" w:cs="Times New Roman"/>
+          <w:bCs/>
+          <w:iCs/>
+          <w:color w:val="000000"/>
+          <w:sz w:val="24"/>
+          <w:szCs w:val="24"/>
+        </w:rPr>
+      </w:pPr>
+      <w:r>
+        <w:rPr>
+          <w:rFonts w:ascii="Times New Roman" w:hAnsi="Times New Roman" w:cs="Times New Roman"/>
+          <w:bCs/>
+          <w:iCs/>
+          <w:noProof/>
+          <w:color w:val="000000"/>
+          <w:sz w:val="24"/>
+          <w:szCs w:val="24"/>
+        </w:rPr>
+        <w:drawing>
+          <wp:inline distT="0" distB="0" distL="0" distR="0" wp14:anchorId="36FA3C69" wp14:editId="38EC6894">
+            <wp:extent cx="5277587" cy="4105848"/>
+            <wp:effectExtent l="0" t="0" r="0" b="9525"/>
+            <wp:docPr id="1243009753" name="Рисунок 1"/>
+            <wp:cNvGraphicFramePr>
+              <a:graphicFrameLocks xmlns:a="http://schemas.openxmlformats.org/drawingml/2006/main" noChangeAspect="1"/>
+            </wp:cNvGraphicFramePr>
+            <a:graphic xmlns:a="http://schemas.openxmlformats.org/drawingml/2006/main">
+              <a:graphicData uri="http://schemas.openxmlformats.org/drawingml/2006/picture">
+                <pic:pic xmlns:pic="http://schemas.openxmlformats.org/drawingml/2006/picture">
+                  <pic:nvPicPr>
+                    <pic:cNvPr id="1243009753" name=""/>
+                    <pic:cNvPicPr/>
+                  </pic:nvPicPr>
+                  <pic:blipFill>
+                    <a:blip r:embed="rId9"/>
+                    <a:stretch>
+                      <a:fillRect/>
+                    </a:stretch>
+                  </pic:blipFill>
+                  <pic:spPr>
+                    <a:xfrm>
+                      <a:off x="0" y="0"/>
+                      <a:ext cx="5277587" cy="4105848"/>
+                    </a:xfrm>
+                    <a:prstGeom prst="rect">
+                      <a:avLst/>
+                    </a:prstGeom>
+                  </pic:spPr>
+                </pic:pic>
+              </a:graphicData>
+            </a:graphic>
+          </wp:inline>
+        </w:drawing>
       </w:r>
     </w:p>
     <w:p>
@@ -1132,7 +1201,7 @@
                     </pic:cNvPicPr>
                   </pic:nvPicPr>
                   <pic:blipFill rotWithShape="1">
-                    <a:blip r:embed="rId9">
+                    <a:blip r:embed="rId10">
                       <a:extLst>
                         <a:ext uri="{28A0092B-C50C-407E-A947-70E740481C1C}">
                           <a14:useLocalDpi xmlns:a14="http://schemas.microsoft.com/office/drawing/2010/main" val="0"/>
@@ -1171,6 +1240,26 @@
     </w:p>
     <w:p>
       <w:pPr>
+        <w:spacing w:after="160" w:line="259" w:lineRule="auto"/>
+        <w:rPr>
+          <w:rFonts w:ascii="Times New Roman" w:eastAsia="Times New Roman" w:hAnsi="Times New Roman"/>
+          <w:sz w:val="24"/>
+          <w:szCs w:val="24"/>
+          <w:lang w:eastAsia="ru-RU"/>
+        </w:rPr>
+      </w:pPr>
+      <w:r>
+        <w:rPr>
+          <w:rFonts w:ascii="Times New Roman" w:eastAsia="Times New Roman" w:hAnsi="Times New Roman"/>
+          <w:sz w:val="24"/>
+          <w:szCs w:val="24"/>
+          <w:lang w:eastAsia="ru-RU"/>
+        </w:rPr>
+        <w:br w:type="page"/>
+      </w:r>
+    </w:p>
+    <w:p>
+      <w:pPr>
         <w:pStyle w:val="a7"/>
         <w:numPr>
           <w:ilvl w:val="0"/>
@@ -1194,6 +1283,7 @@
           <w:szCs w:val="24"/>
           <w:lang w:eastAsia="ru-RU"/>
         </w:rPr>
+        <w:lastRenderedPageBreak/>
         <w:t>Создание локальной копии главного репозитория</w:t>
       </w:r>
       <w:r>
@@ -1244,7 +1334,7 @@
                     </pic:cNvPicPr>
                   </pic:nvPicPr>
                   <pic:blipFill rotWithShape="1">
-                    <a:blip r:embed="rId10">
+                    <a:blip r:embed="rId11">
                       <a:extLst>
                         <a:ext uri="{28A0092B-C50C-407E-A947-70E740481C1C}">
                           <a14:useLocalDpi xmlns:a14="http://schemas.microsoft.com/office/drawing/2010/main" val="0"/>
@@ -1283,32 +1373,6 @@
     </w:p>
     <w:p>
       <w:pPr>
-        <w:spacing w:after="160" w:line="259" w:lineRule="auto"/>
-        <w:rPr>
-          <w:rFonts w:ascii="Times New Roman" w:hAnsi="Times New Roman" w:cs="Times New Roman"/>
-          <w:bCs/>
-          <w:i/>
-          <w:color w:val="000000"/>
-          <w:sz w:val="24"/>
-          <w:szCs w:val="24"/>
-          <w:u w:val="single"/>
-        </w:rPr>
-      </w:pPr>
-      <w:r>
-        <w:rPr>
-          <w:rFonts w:ascii="Times New Roman" w:hAnsi="Times New Roman" w:cs="Times New Roman"/>
-          <w:bCs/>
-          <w:i/>
-          <w:color w:val="000000"/>
-          <w:sz w:val="24"/>
-          <w:szCs w:val="24"/>
-          <w:u w:val="single"/>
-        </w:rPr>
-        <w:br w:type="page"/>
-      </w:r>
-    </w:p>
-    <w:p>
-      <w:pPr>
         <w:pStyle w:val="a7"/>
         <w:numPr>
           <w:ilvl w:val="0"/>
@@ -1332,7 +1396,6 @@
           <w:szCs w:val="24"/>
           <w:lang w:eastAsia="ru-RU"/>
         </w:rPr>
-        <w:lastRenderedPageBreak/>
         <w:t>Создание ветки</w:t>
       </w:r>
       <w:r>
@@ -1440,6 +1503,7 @@
         <w:pStyle w:val="a7"/>
         <w:spacing w:line="240" w:lineRule="auto"/>
         <w:ind w:left="-207"/>
+        <w:jc w:val="center"/>
         <w:rPr>
           <w:rFonts w:ascii="Times New Roman" w:hAnsi="Times New Roman" w:cs="Times New Roman"/>
           <w:bCs/>
@@ -1472,7 +1536,7 @@
                     </pic:cNvPicPr>
                   </pic:nvPicPr>
                   <pic:blipFill rotWithShape="1">
-                    <a:blip r:embed="rId11">
+                    <a:blip r:embed="rId12">
                       <a:extLst>
                         <a:ext uri="{28A0092B-C50C-407E-A947-70E740481C1C}">
                           <a14:useLocalDpi xmlns:a14="http://schemas.microsoft.com/office/drawing/2010/main" val="0"/>
@@ -1511,6 +1575,2371 @@
     </w:p>
     <w:p>
       <w:pPr>
+        <w:spacing w:after="160" w:line="259" w:lineRule="auto"/>
+        <w:rPr>
+          <w:rFonts w:ascii="Times New Roman" w:hAnsi="Times New Roman" w:cs="Times New Roman"/>
+          <w:bCs/>
+          <w:iCs/>
+          <w:color w:val="000000"/>
+          <w:sz w:val="24"/>
+          <w:szCs w:val="24"/>
+        </w:rPr>
+      </w:pPr>
+      <w:r>
+        <w:rPr>
+          <w:rFonts w:ascii="Times New Roman" w:hAnsi="Times New Roman" w:cs="Times New Roman"/>
+          <w:bCs/>
+          <w:iCs/>
+          <w:color w:val="000000"/>
+          <w:sz w:val="24"/>
+          <w:szCs w:val="24"/>
+        </w:rPr>
+        <w:br w:type="page"/>
+      </w:r>
+    </w:p>
+    <w:p>
+      <w:pPr>
+        <w:pStyle w:val="a7"/>
+        <w:numPr>
+          <w:ilvl w:val="0"/>
+          <w:numId w:val="7"/>
+        </w:numPr>
+        <w:spacing w:line="240" w:lineRule="auto"/>
+        <w:rPr>
+          <w:rFonts w:ascii="Times New Roman" w:hAnsi="Times New Roman" w:cs="Times New Roman"/>
+          <w:bCs/>
+          <w:iCs/>
+          <w:color w:val="000000"/>
+          <w:sz w:val="24"/>
+          <w:szCs w:val="24"/>
+        </w:rPr>
+      </w:pPr>
+      <w:r>
+        <w:rPr>
+          <w:rFonts w:ascii="Times New Roman" w:hAnsi="Times New Roman" w:cs="Times New Roman"/>
+          <w:bCs/>
+          <w:iCs/>
+          <w:color w:val="000000"/>
+          <w:sz w:val="24"/>
+          <w:szCs w:val="24"/>
+        </w:rPr>
+        <w:lastRenderedPageBreak/>
+        <w:t xml:space="preserve">Добавил папки </w:t>
+      </w:r>
+      <w:r>
+        <w:rPr>
+          <w:rFonts w:ascii="Times New Roman" w:hAnsi="Times New Roman" w:cs="Times New Roman"/>
+          <w:bCs/>
+          <w:iCs/>
+          <w:color w:val="000000"/>
+          <w:sz w:val="24"/>
+          <w:szCs w:val="24"/>
+          <w:lang w:val="en-US"/>
+        </w:rPr>
+        <w:t>Lr</w:t>
+      </w:r>
+      <w:r>
+        <w:rPr>
+          <w:rFonts w:ascii="Times New Roman" w:hAnsi="Times New Roman" w:cs="Times New Roman"/>
+          <w:bCs/>
+          <w:iCs/>
+          <w:color w:val="000000"/>
+          <w:sz w:val="24"/>
+          <w:szCs w:val="24"/>
+        </w:rPr>
+        <w:t xml:space="preserve">1, </w:t>
+      </w:r>
+      <w:r>
+        <w:rPr>
+          <w:rFonts w:ascii="Times New Roman" w:hAnsi="Times New Roman" w:cs="Times New Roman"/>
+          <w:bCs/>
+          <w:iCs/>
+          <w:color w:val="000000"/>
+          <w:sz w:val="24"/>
+          <w:szCs w:val="24"/>
+          <w:lang w:val="en-US"/>
+        </w:rPr>
+        <w:t>Lr</w:t>
+      </w:r>
+      <w:r>
+        <w:rPr>
+          <w:rFonts w:ascii="Times New Roman" w:hAnsi="Times New Roman" w:cs="Times New Roman"/>
+          <w:bCs/>
+          <w:iCs/>
+          <w:color w:val="000000"/>
+          <w:sz w:val="24"/>
+          <w:szCs w:val="24"/>
+        </w:rPr>
+        <w:t xml:space="preserve">2, </w:t>
+      </w:r>
+      <w:r>
+        <w:rPr>
+          <w:rFonts w:ascii="Times New Roman" w:hAnsi="Times New Roman" w:cs="Times New Roman"/>
+          <w:bCs/>
+          <w:iCs/>
+          <w:color w:val="000000"/>
+          <w:sz w:val="24"/>
+          <w:szCs w:val="24"/>
+          <w:lang w:val="en-US"/>
+        </w:rPr>
+        <w:t>Lr</w:t>
+      </w:r>
+      <w:r>
+        <w:rPr>
+          <w:rFonts w:ascii="Times New Roman" w:hAnsi="Times New Roman" w:cs="Times New Roman"/>
+          <w:bCs/>
+          <w:iCs/>
+          <w:color w:val="000000"/>
+          <w:sz w:val="24"/>
+          <w:szCs w:val="24"/>
+        </w:rPr>
+        <w:t>3</w:t>
+      </w:r>
+      <w:r>
+        <w:rPr>
+          <w:rFonts w:ascii="Times New Roman" w:hAnsi="Times New Roman" w:cs="Times New Roman"/>
+          <w:bCs/>
+          <w:iCs/>
+          <w:color w:val="000000"/>
+          <w:sz w:val="24"/>
+          <w:szCs w:val="24"/>
+        </w:rPr>
+        <w:t xml:space="preserve"> с проектами и отчетами</w:t>
+      </w:r>
+      <w:r>
+        <w:rPr>
+          <w:rFonts w:ascii="Times New Roman" w:hAnsi="Times New Roman" w:cs="Times New Roman"/>
+          <w:bCs/>
+          <w:iCs/>
+          <w:color w:val="000000"/>
+          <w:sz w:val="24"/>
+          <w:szCs w:val="24"/>
+        </w:rPr>
+        <w:t xml:space="preserve"> в </w:t>
+      </w:r>
+      <w:r>
+        <w:rPr>
+          <w:rFonts w:ascii="Times New Roman" w:hAnsi="Times New Roman" w:cs="Times New Roman"/>
+          <w:bCs/>
+          <w:iCs/>
+          <w:color w:val="000000"/>
+          <w:sz w:val="24"/>
+          <w:szCs w:val="24"/>
+        </w:rPr>
+        <w:t>отслеживание</w:t>
+      </w:r>
+      <w:r>
+        <w:rPr>
+          <w:rFonts w:ascii="Times New Roman" w:hAnsi="Times New Roman" w:cs="Times New Roman"/>
+          <w:bCs/>
+          <w:iCs/>
+          <w:color w:val="000000"/>
+          <w:sz w:val="24"/>
+          <w:szCs w:val="24"/>
+        </w:rPr>
+        <w:t xml:space="preserve"> </w:t>
+      </w:r>
+      <w:r>
+        <w:rPr>
+          <w:rFonts w:ascii="Times New Roman" w:hAnsi="Times New Roman" w:cs="Times New Roman"/>
+          <w:bCs/>
+          <w:iCs/>
+          <w:color w:val="000000"/>
+          <w:sz w:val="24"/>
+          <w:szCs w:val="24"/>
+          <w:lang w:val="en-US"/>
+        </w:rPr>
+        <w:t>git</w:t>
+      </w:r>
+    </w:p>
+    <w:p>
+      <w:pPr>
+        <w:pStyle w:val="a7"/>
+        <w:spacing w:line="240" w:lineRule="auto"/>
+        <w:ind w:left="-207"/>
+        <w:jc w:val="center"/>
+        <w:rPr>
+          <w:rFonts w:ascii="Times New Roman" w:hAnsi="Times New Roman" w:cs="Times New Roman"/>
+          <w:bCs/>
+          <w:iCs/>
+          <w:color w:val="000000"/>
+          <w:sz w:val="24"/>
+          <w:szCs w:val="24"/>
+        </w:rPr>
+      </w:pPr>
+      <w:r>
+        <w:rPr>
+          <w:rFonts w:ascii="Times New Roman" w:hAnsi="Times New Roman" w:cs="Times New Roman"/>
+          <w:bCs/>
+          <w:iCs/>
+          <w:noProof/>
+          <w:color w:val="000000"/>
+          <w:sz w:val="24"/>
+          <w:szCs w:val="24"/>
+        </w:rPr>
+        <w:drawing>
+          <wp:inline distT="0" distB="0" distL="0" distR="0" wp14:anchorId="425823EF" wp14:editId="2B76B8E8">
+            <wp:extent cx="5940425" cy="4259580"/>
+            <wp:effectExtent l="0" t="0" r="3175" b="7620"/>
+            <wp:docPr id="1056091744" name="Рисунок 1"/>
+            <wp:cNvGraphicFramePr>
+              <a:graphicFrameLocks xmlns:a="http://schemas.openxmlformats.org/drawingml/2006/main" noChangeAspect="1"/>
+            </wp:cNvGraphicFramePr>
+            <a:graphic xmlns:a="http://schemas.openxmlformats.org/drawingml/2006/main">
+              <a:graphicData uri="http://schemas.openxmlformats.org/drawingml/2006/picture">
+                <pic:pic xmlns:pic="http://schemas.openxmlformats.org/drawingml/2006/picture">
+                  <pic:nvPicPr>
+                    <pic:cNvPr id="1056091744" name=""/>
+                    <pic:cNvPicPr/>
+                  </pic:nvPicPr>
+                  <pic:blipFill>
+                    <a:blip r:embed="rId13"/>
+                    <a:stretch>
+                      <a:fillRect/>
+                    </a:stretch>
+                  </pic:blipFill>
+                  <pic:spPr>
+                    <a:xfrm>
+                      <a:off x="0" y="0"/>
+                      <a:ext cx="5940425" cy="4259580"/>
+                    </a:xfrm>
+                    <a:prstGeom prst="rect">
+                      <a:avLst/>
+                    </a:prstGeom>
+                  </pic:spPr>
+                </pic:pic>
+              </a:graphicData>
+            </a:graphic>
+          </wp:inline>
+        </w:drawing>
+      </w:r>
+    </w:p>
+    <w:p>
+      <w:pPr>
+        <w:pStyle w:val="a7"/>
+        <w:spacing w:line="240" w:lineRule="auto"/>
+        <w:ind w:left="-207"/>
+        <w:rPr>
+          <w:rFonts w:ascii="Times New Roman" w:hAnsi="Times New Roman" w:cs="Times New Roman"/>
+          <w:bCs/>
+          <w:iCs/>
+          <w:color w:val="000000"/>
+          <w:sz w:val="24"/>
+          <w:szCs w:val="24"/>
+        </w:rPr>
+      </w:pPr>
+    </w:p>
+    <w:p>
+      <w:pPr>
+        <w:pStyle w:val="a7"/>
+        <w:spacing w:line="240" w:lineRule="auto"/>
+        <w:ind w:left="-207"/>
+        <w:jc w:val="center"/>
+        <w:rPr>
+          <w:rFonts w:ascii="Times New Roman" w:hAnsi="Times New Roman" w:cs="Times New Roman"/>
+          <w:bCs/>
+          <w:iCs/>
+          <w:color w:val="000000"/>
+          <w:sz w:val="24"/>
+          <w:szCs w:val="24"/>
+        </w:rPr>
+      </w:pPr>
+      <w:r>
+        <w:rPr>
+          <w:rFonts w:ascii="Times New Roman" w:hAnsi="Times New Roman" w:cs="Times New Roman"/>
+          <w:bCs/>
+          <w:iCs/>
+          <w:noProof/>
+          <w:color w:val="000000"/>
+          <w:sz w:val="24"/>
+          <w:szCs w:val="24"/>
+        </w:rPr>
+        <w:drawing>
+          <wp:inline distT="0" distB="0" distL="0" distR="0" wp14:anchorId="614A1AE6" wp14:editId="48BDC602">
+            <wp:extent cx="5940425" cy="4488180"/>
+            <wp:effectExtent l="0" t="0" r="3175" b="7620"/>
+            <wp:docPr id="232696601" name="Рисунок 1"/>
+            <wp:cNvGraphicFramePr>
+              <a:graphicFrameLocks xmlns:a="http://schemas.openxmlformats.org/drawingml/2006/main" noChangeAspect="1"/>
+            </wp:cNvGraphicFramePr>
+            <a:graphic xmlns:a="http://schemas.openxmlformats.org/drawingml/2006/main">
+              <a:graphicData uri="http://schemas.openxmlformats.org/drawingml/2006/picture">
+                <pic:pic xmlns:pic="http://schemas.openxmlformats.org/drawingml/2006/picture">
+                  <pic:nvPicPr>
+                    <pic:cNvPr id="232696601" name=""/>
+                    <pic:cNvPicPr/>
+                  </pic:nvPicPr>
+                  <pic:blipFill>
+                    <a:blip r:embed="rId14"/>
+                    <a:stretch>
+                      <a:fillRect/>
+                    </a:stretch>
+                  </pic:blipFill>
+                  <pic:spPr>
+                    <a:xfrm>
+                      <a:off x="0" y="0"/>
+                      <a:ext cx="5940425" cy="4488180"/>
+                    </a:xfrm>
+                    <a:prstGeom prst="rect">
+                      <a:avLst/>
+                    </a:prstGeom>
+                  </pic:spPr>
+                </pic:pic>
+              </a:graphicData>
+            </a:graphic>
+          </wp:inline>
+        </w:drawing>
+      </w:r>
+    </w:p>
+    <w:p>
+      <w:pPr>
+        <w:pStyle w:val="a7"/>
+        <w:numPr>
+          <w:ilvl w:val="0"/>
+          <w:numId w:val="7"/>
+        </w:numPr>
+        <w:spacing w:line="240" w:lineRule="auto"/>
+        <w:rPr>
+          <w:rFonts w:ascii="Times New Roman" w:hAnsi="Times New Roman" w:cs="Times New Roman"/>
+          <w:bCs/>
+          <w:iCs/>
+          <w:color w:val="000000"/>
+          <w:sz w:val="24"/>
+          <w:szCs w:val="24"/>
+        </w:rPr>
+      </w:pPr>
+      <w:r>
+        <w:rPr>
+          <w:rFonts w:ascii="Times New Roman" w:hAnsi="Times New Roman" w:cs="Times New Roman"/>
+          <w:bCs/>
+          <w:iCs/>
+          <w:color w:val="000000"/>
+          <w:sz w:val="24"/>
+          <w:szCs w:val="24"/>
+        </w:rPr>
+        <w:lastRenderedPageBreak/>
+        <w:t xml:space="preserve">Добавили файл </w:t>
+      </w:r>
+      <w:r>
+        <w:rPr>
+          <w:rFonts w:ascii="Times New Roman" w:hAnsi="Times New Roman" w:cs="Times New Roman"/>
+          <w:bCs/>
+          <w:iCs/>
+          <w:color w:val="000000"/>
+          <w:sz w:val="24"/>
+          <w:szCs w:val="24"/>
+          <w:lang w:val="en-US"/>
+        </w:rPr>
+        <w:t>test</w:t>
+      </w:r>
+      <w:r>
+        <w:rPr>
+          <w:rFonts w:ascii="Times New Roman" w:hAnsi="Times New Roman" w:cs="Times New Roman"/>
+          <w:bCs/>
+          <w:iCs/>
+          <w:color w:val="000000"/>
+          <w:sz w:val="24"/>
+          <w:szCs w:val="24"/>
+        </w:rPr>
+        <w:t>.</w:t>
+      </w:r>
+      <w:r>
+        <w:rPr>
+          <w:rFonts w:ascii="Times New Roman" w:hAnsi="Times New Roman" w:cs="Times New Roman"/>
+          <w:bCs/>
+          <w:iCs/>
+          <w:color w:val="000000"/>
+          <w:sz w:val="24"/>
+          <w:szCs w:val="24"/>
+          <w:lang w:val="en-US"/>
+        </w:rPr>
+        <w:t>txt</w:t>
+      </w:r>
+      <w:r>
+        <w:rPr>
+          <w:rFonts w:ascii="Times New Roman" w:hAnsi="Times New Roman" w:cs="Times New Roman"/>
+          <w:bCs/>
+          <w:iCs/>
+          <w:color w:val="000000"/>
+          <w:sz w:val="24"/>
+          <w:szCs w:val="24"/>
+        </w:rPr>
+        <w:t xml:space="preserve"> </w:t>
+      </w:r>
+      <w:r>
+        <w:rPr>
+          <w:rFonts w:ascii="Times New Roman" w:hAnsi="Times New Roman" w:cs="Times New Roman"/>
+          <w:bCs/>
+          <w:iCs/>
+          <w:color w:val="000000"/>
+          <w:sz w:val="24"/>
+          <w:szCs w:val="24"/>
+        </w:rPr>
+        <w:t xml:space="preserve">в папки </w:t>
+      </w:r>
+      <w:r>
+        <w:rPr>
+          <w:rFonts w:ascii="Times New Roman" w:hAnsi="Times New Roman" w:cs="Times New Roman"/>
+          <w:bCs/>
+          <w:iCs/>
+          <w:color w:val="000000"/>
+          <w:sz w:val="24"/>
+          <w:szCs w:val="24"/>
+          <w:lang w:val="en-US"/>
+        </w:rPr>
+        <w:t>Lr</w:t>
+      </w:r>
+      <w:r>
+        <w:rPr>
+          <w:rFonts w:ascii="Times New Roman" w:hAnsi="Times New Roman" w:cs="Times New Roman"/>
+          <w:bCs/>
+          <w:iCs/>
+          <w:color w:val="000000"/>
+          <w:sz w:val="24"/>
+          <w:szCs w:val="24"/>
+        </w:rPr>
+        <w:t xml:space="preserve">1, </w:t>
+      </w:r>
+      <w:r>
+        <w:rPr>
+          <w:rFonts w:ascii="Times New Roman" w:hAnsi="Times New Roman" w:cs="Times New Roman"/>
+          <w:bCs/>
+          <w:iCs/>
+          <w:color w:val="000000"/>
+          <w:sz w:val="24"/>
+          <w:szCs w:val="24"/>
+          <w:lang w:val="en-US"/>
+        </w:rPr>
+        <w:t>Lr</w:t>
+      </w:r>
+      <w:r>
+        <w:rPr>
+          <w:rFonts w:ascii="Times New Roman" w:hAnsi="Times New Roman" w:cs="Times New Roman"/>
+          <w:bCs/>
+          <w:iCs/>
+          <w:color w:val="000000"/>
+          <w:sz w:val="24"/>
+          <w:szCs w:val="24"/>
+        </w:rPr>
+        <w:t xml:space="preserve">2, </w:t>
+      </w:r>
+      <w:r>
+        <w:rPr>
+          <w:rFonts w:ascii="Times New Roman" w:hAnsi="Times New Roman" w:cs="Times New Roman"/>
+          <w:bCs/>
+          <w:iCs/>
+          <w:color w:val="000000"/>
+          <w:sz w:val="24"/>
+          <w:szCs w:val="24"/>
+          <w:lang w:val="en-US"/>
+        </w:rPr>
+        <w:t>Lr</w:t>
+      </w:r>
+      <w:r>
+        <w:rPr>
+          <w:rFonts w:ascii="Times New Roman" w:hAnsi="Times New Roman" w:cs="Times New Roman"/>
+          <w:bCs/>
+          <w:iCs/>
+          <w:color w:val="000000"/>
+          <w:sz w:val="24"/>
+          <w:szCs w:val="24"/>
+        </w:rPr>
+        <w:t>3</w:t>
+      </w:r>
+      <w:r>
+        <w:rPr>
+          <w:rFonts w:ascii="Times New Roman" w:hAnsi="Times New Roman" w:cs="Times New Roman"/>
+          <w:bCs/>
+          <w:iCs/>
+          <w:color w:val="000000"/>
+          <w:sz w:val="24"/>
+          <w:szCs w:val="24"/>
+        </w:rPr>
+        <w:t>:</w:t>
+      </w:r>
+    </w:p>
+    <w:p>
+      <w:pPr>
+        <w:pStyle w:val="a7"/>
+        <w:spacing w:line="240" w:lineRule="auto"/>
+        <w:ind w:left="-207"/>
+        <w:jc w:val="center"/>
+        <w:rPr>
+          <w:rFonts w:ascii="Times New Roman" w:hAnsi="Times New Roman" w:cs="Times New Roman"/>
+          <w:bCs/>
+          <w:iCs/>
+          <w:color w:val="000000"/>
+          <w:sz w:val="24"/>
+          <w:szCs w:val="24"/>
+        </w:rPr>
+      </w:pPr>
+      <w:r>
+        <w:rPr>
+          <w:rFonts w:ascii="Times New Roman" w:hAnsi="Times New Roman" w:cs="Times New Roman"/>
+          <w:bCs/>
+          <w:iCs/>
+          <w:noProof/>
+          <w:color w:val="000000"/>
+          <w:sz w:val="24"/>
+          <w:szCs w:val="24"/>
+        </w:rPr>
+        <w:drawing>
+          <wp:inline distT="0" distB="0" distL="0" distR="0" wp14:anchorId="256097D6" wp14:editId="57BB53F4">
+            <wp:extent cx="5940425" cy="2501265"/>
+            <wp:effectExtent l="0" t="0" r="3175" b="0"/>
+            <wp:docPr id="1867875852" name="Рисунок 1"/>
+            <wp:cNvGraphicFramePr>
+              <a:graphicFrameLocks xmlns:a="http://schemas.openxmlformats.org/drawingml/2006/main" noChangeAspect="1"/>
+            </wp:cNvGraphicFramePr>
+            <a:graphic xmlns:a="http://schemas.openxmlformats.org/drawingml/2006/main">
+              <a:graphicData uri="http://schemas.openxmlformats.org/drawingml/2006/picture">
+                <pic:pic xmlns:pic="http://schemas.openxmlformats.org/drawingml/2006/picture">
+                  <pic:nvPicPr>
+                    <pic:cNvPr id="1867875852" name=""/>
+                    <pic:cNvPicPr/>
+                  </pic:nvPicPr>
+                  <pic:blipFill>
+                    <a:blip r:embed="rId15"/>
+                    <a:stretch>
+                      <a:fillRect/>
+                    </a:stretch>
+                  </pic:blipFill>
+                  <pic:spPr>
+                    <a:xfrm>
+                      <a:off x="0" y="0"/>
+                      <a:ext cx="5940425" cy="2501265"/>
+                    </a:xfrm>
+                    <a:prstGeom prst="rect">
+                      <a:avLst/>
+                    </a:prstGeom>
+                  </pic:spPr>
+                </pic:pic>
+              </a:graphicData>
+            </a:graphic>
+          </wp:inline>
+        </w:drawing>
+      </w:r>
+    </w:p>
+    <w:p>
+      <w:pPr>
+        <w:pStyle w:val="a7"/>
+        <w:numPr>
+          <w:ilvl w:val="0"/>
+          <w:numId w:val="7"/>
+        </w:numPr>
+        <w:spacing w:line="240" w:lineRule="auto"/>
+        <w:rPr>
+          <w:rFonts w:ascii="Times New Roman" w:hAnsi="Times New Roman" w:cs="Times New Roman"/>
+          <w:bCs/>
+          <w:iCs/>
+          <w:color w:val="000000"/>
+          <w:sz w:val="24"/>
+          <w:szCs w:val="24"/>
+        </w:rPr>
+      </w:pPr>
+      <w:r>
+        <w:rPr>
+          <w:rFonts w:ascii="Times New Roman" w:hAnsi="Times New Roman" w:cs="Times New Roman"/>
+          <w:bCs/>
+          <w:iCs/>
+          <w:color w:val="000000"/>
+          <w:sz w:val="24"/>
+          <w:szCs w:val="24"/>
+        </w:rPr>
+        <w:t>Добавил строчку "</w:t>
+      </w:r>
+      <w:proofErr w:type="spellStart"/>
+      <w:r>
+        <w:rPr>
+          <w:rFonts w:ascii="Times New Roman" w:hAnsi="Times New Roman" w:cs="Times New Roman"/>
+          <w:bCs/>
+          <w:iCs/>
+          <w:color w:val="000000"/>
+          <w:sz w:val="24"/>
+          <w:szCs w:val="24"/>
+        </w:rPr>
+        <w:t>new</w:t>
+      </w:r>
+      <w:proofErr w:type="spellEnd"/>
+      <w:r>
+        <w:rPr>
+          <w:rFonts w:ascii="Times New Roman" w:hAnsi="Times New Roman" w:cs="Times New Roman"/>
+          <w:bCs/>
+          <w:iCs/>
+          <w:color w:val="000000"/>
+          <w:sz w:val="24"/>
+          <w:szCs w:val="24"/>
+        </w:rPr>
+        <w:t xml:space="preserve"> Test" в файл test.txt в папке Lr1</w:t>
+      </w:r>
+    </w:p>
+    <w:p>
+      <w:pPr>
+        <w:pStyle w:val="a7"/>
+        <w:spacing w:line="240" w:lineRule="auto"/>
+        <w:ind w:left="-207"/>
+        <w:jc w:val="center"/>
+        <w:rPr>
+          <w:rFonts w:ascii="Times New Roman" w:hAnsi="Times New Roman" w:cs="Times New Roman"/>
+          <w:bCs/>
+          <w:iCs/>
+          <w:color w:val="000000"/>
+          <w:sz w:val="24"/>
+          <w:szCs w:val="24"/>
+          <w:lang w:val="en-US"/>
+        </w:rPr>
+      </w:pPr>
+      <w:r>
+        <w:rPr>
+          <w:rFonts w:ascii="Times New Roman" w:hAnsi="Times New Roman" w:cs="Times New Roman"/>
+          <w:bCs/>
+          <w:iCs/>
+          <w:noProof/>
+          <w:color w:val="000000"/>
+          <w:sz w:val="24"/>
+          <w:szCs w:val="24"/>
+        </w:rPr>
+        <w:drawing>
+          <wp:inline distT="0" distB="0" distL="0" distR="0" wp14:anchorId="5A17CDE4" wp14:editId="0DC1BC88">
+            <wp:extent cx="5940425" cy="2995295"/>
+            <wp:effectExtent l="0" t="0" r="3175" b="0"/>
+            <wp:docPr id="193011667" name="Рисунок 1"/>
+            <wp:cNvGraphicFramePr>
+              <a:graphicFrameLocks xmlns:a="http://schemas.openxmlformats.org/drawingml/2006/main" noChangeAspect="1"/>
+            </wp:cNvGraphicFramePr>
+            <a:graphic xmlns:a="http://schemas.openxmlformats.org/drawingml/2006/main">
+              <a:graphicData uri="http://schemas.openxmlformats.org/drawingml/2006/picture">
+                <pic:pic xmlns:pic="http://schemas.openxmlformats.org/drawingml/2006/picture">
+                  <pic:nvPicPr>
+                    <pic:cNvPr id="193011667" name=""/>
+                    <pic:cNvPicPr/>
+                  </pic:nvPicPr>
+                  <pic:blipFill>
+                    <a:blip r:embed="rId16"/>
+                    <a:stretch>
+                      <a:fillRect/>
+                    </a:stretch>
+                  </pic:blipFill>
+                  <pic:spPr>
+                    <a:xfrm>
+                      <a:off x="0" y="0"/>
+                      <a:ext cx="5940425" cy="2995295"/>
+                    </a:xfrm>
+                    <a:prstGeom prst="rect">
+                      <a:avLst/>
+                    </a:prstGeom>
+                  </pic:spPr>
+                </pic:pic>
+              </a:graphicData>
+            </a:graphic>
+          </wp:inline>
+        </w:drawing>
+      </w:r>
+    </w:p>
+    <w:p>
+      <w:pPr>
+        <w:pStyle w:val="a7"/>
+        <w:numPr>
+          <w:ilvl w:val="0"/>
+          <w:numId w:val="7"/>
+        </w:numPr>
+        <w:spacing w:line="240" w:lineRule="auto"/>
+        <w:rPr>
+          <w:rFonts w:ascii="Times New Roman" w:hAnsi="Times New Roman" w:cs="Times New Roman"/>
+          <w:bCs/>
+          <w:iCs/>
+          <w:color w:val="000000"/>
+          <w:sz w:val="24"/>
+          <w:szCs w:val="24"/>
+        </w:rPr>
+      </w:pPr>
+      <w:r>
+        <w:rPr>
+          <w:rFonts w:ascii="Times New Roman" w:hAnsi="Times New Roman" w:cs="Times New Roman"/>
+          <w:bCs/>
+          <w:iCs/>
+          <w:color w:val="000000"/>
+          <w:sz w:val="24"/>
+          <w:szCs w:val="24"/>
+        </w:rPr>
+        <w:t>Очистил</w:t>
+      </w:r>
+      <w:r>
+        <w:rPr>
+          <w:rFonts w:ascii="Times New Roman" w:hAnsi="Times New Roman" w:cs="Times New Roman"/>
+          <w:bCs/>
+          <w:iCs/>
+          <w:color w:val="000000"/>
+          <w:sz w:val="24"/>
+          <w:szCs w:val="24"/>
+        </w:rPr>
+        <w:t xml:space="preserve"> содержимое</w:t>
+      </w:r>
+      <w:r>
+        <w:rPr>
+          <w:rFonts w:ascii="Times New Roman" w:hAnsi="Times New Roman" w:cs="Times New Roman"/>
+          <w:bCs/>
+          <w:iCs/>
+          <w:color w:val="000000"/>
+          <w:sz w:val="24"/>
+          <w:szCs w:val="24"/>
+        </w:rPr>
+        <w:t xml:space="preserve"> фай</w:t>
+      </w:r>
+      <w:r>
+        <w:rPr>
+          <w:rFonts w:ascii="Times New Roman" w:hAnsi="Times New Roman" w:cs="Times New Roman"/>
+          <w:bCs/>
+          <w:iCs/>
+          <w:color w:val="000000"/>
+          <w:sz w:val="24"/>
+          <w:szCs w:val="24"/>
+        </w:rPr>
+        <w:t>ла</w:t>
+      </w:r>
+      <w:r>
+        <w:rPr>
+          <w:rFonts w:ascii="Times New Roman" w:hAnsi="Times New Roman" w:cs="Times New Roman"/>
+          <w:bCs/>
+          <w:iCs/>
+          <w:color w:val="000000"/>
+          <w:sz w:val="24"/>
+          <w:szCs w:val="24"/>
+        </w:rPr>
+        <w:t xml:space="preserve"> </w:t>
+      </w:r>
+      <w:r>
+        <w:rPr>
+          <w:rFonts w:ascii="Times New Roman" w:hAnsi="Times New Roman" w:cs="Times New Roman"/>
+          <w:bCs/>
+          <w:iCs/>
+          <w:color w:val="000000"/>
+          <w:sz w:val="24"/>
+          <w:szCs w:val="24"/>
+          <w:lang w:val="en-US"/>
+        </w:rPr>
+        <w:t>test</w:t>
+      </w:r>
+      <w:r>
+        <w:rPr>
+          <w:rFonts w:ascii="Times New Roman" w:hAnsi="Times New Roman" w:cs="Times New Roman"/>
+          <w:bCs/>
+          <w:iCs/>
+          <w:color w:val="000000"/>
+          <w:sz w:val="24"/>
+          <w:szCs w:val="24"/>
+        </w:rPr>
+        <w:t>.</w:t>
+      </w:r>
+      <w:r>
+        <w:rPr>
+          <w:rFonts w:ascii="Times New Roman" w:hAnsi="Times New Roman" w:cs="Times New Roman"/>
+          <w:bCs/>
+          <w:iCs/>
+          <w:color w:val="000000"/>
+          <w:sz w:val="24"/>
+          <w:szCs w:val="24"/>
+          <w:lang w:val="en-US"/>
+        </w:rPr>
+        <w:t>txt</w:t>
+      </w:r>
+      <w:r>
+        <w:rPr>
+          <w:rFonts w:ascii="Times New Roman" w:hAnsi="Times New Roman" w:cs="Times New Roman"/>
+          <w:bCs/>
+          <w:iCs/>
+          <w:color w:val="000000"/>
+          <w:sz w:val="24"/>
+          <w:szCs w:val="24"/>
+        </w:rPr>
+        <w:t xml:space="preserve"> в папке </w:t>
+      </w:r>
+      <w:r>
+        <w:rPr>
+          <w:rFonts w:ascii="Times New Roman" w:hAnsi="Times New Roman" w:cs="Times New Roman"/>
+          <w:bCs/>
+          <w:iCs/>
+          <w:color w:val="000000"/>
+          <w:sz w:val="24"/>
+          <w:szCs w:val="24"/>
+          <w:lang w:val="en-US"/>
+        </w:rPr>
+        <w:t>Lr</w:t>
+      </w:r>
+      <w:r>
+        <w:rPr>
+          <w:rFonts w:ascii="Times New Roman" w:hAnsi="Times New Roman" w:cs="Times New Roman"/>
+          <w:bCs/>
+          <w:iCs/>
+          <w:color w:val="000000"/>
+          <w:sz w:val="24"/>
+          <w:szCs w:val="24"/>
+        </w:rPr>
+        <w:t>2</w:t>
+      </w:r>
+      <w:r>
+        <w:rPr>
+          <w:rFonts w:ascii="Times New Roman" w:hAnsi="Times New Roman" w:cs="Times New Roman"/>
+          <w:bCs/>
+          <w:iCs/>
+          <w:color w:val="000000"/>
+          <w:sz w:val="24"/>
+          <w:szCs w:val="24"/>
+        </w:rPr>
+        <w:t>:</w:t>
+      </w:r>
+    </w:p>
+    <w:p>
+      <w:pPr>
+        <w:pStyle w:val="a7"/>
+        <w:spacing w:line="240" w:lineRule="auto"/>
+        <w:ind w:left="-207"/>
+        <w:jc w:val="center"/>
+        <w:rPr>
+          <w:rFonts w:ascii="Times New Roman" w:hAnsi="Times New Roman" w:cs="Times New Roman"/>
+          <w:bCs/>
+          <w:iCs/>
+          <w:color w:val="000000"/>
+          <w:sz w:val="24"/>
+          <w:szCs w:val="24"/>
+          <w:lang w:val="en-US"/>
+        </w:rPr>
+      </w:pPr>
+      <w:r>
+        <w:rPr>
+          <w:rFonts w:ascii="Times New Roman" w:hAnsi="Times New Roman" w:cs="Times New Roman"/>
+          <w:bCs/>
+          <w:iCs/>
+          <w:noProof/>
+          <w:color w:val="000000"/>
+          <w:sz w:val="24"/>
+          <w:szCs w:val="24"/>
+          <w:lang w:val="en-US"/>
+        </w:rPr>
+        <w:drawing>
+          <wp:inline distT="0" distB="0" distL="0" distR="0" wp14:anchorId="05019F04" wp14:editId="55267338">
+            <wp:extent cx="5940425" cy="3127375"/>
+            <wp:effectExtent l="0" t="0" r="3175" b="0"/>
+            <wp:docPr id="1841172062" name="Рисунок 1"/>
+            <wp:cNvGraphicFramePr>
+              <a:graphicFrameLocks xmlns:a="http://schemas.openxmlformats.org/drawingml/2006/main" noChangeAspect="1"/>
+            </wp:cNvGraphicFramePr>
+            <a:graphic xmlns:a="http://schemas.openxmlformats.org/drawingml/2006/main">
+              <a:graphicData uri="http://schemas.openxmlformats.org/drawingml/2006/picture">
+                <pic:pic xmlns:pic="http://schemas.openxmlformats.org/drawingml/2006/picture">
+                  <pic:nvPicPr>
+                    <pic:cNvPr id="1841172062" name=""/>
+                    <pic:cNvPicPr/>
+                  </pic:nvPicPr>
+                  <pic:blipFill>
+                    <a:blip r:embed="rId17"/>
+                    <a:stretch>
+                      <a:fillRect/>
+                    </a:stretch>
+                  </pic:blipFill>
+                  <pic:spPr>
+                    <a:xfrm>
+                      <a:off x="0" y="0"/>
+                      <a:ext cx="5940425" cy="3127375"/>
+                    </a:xfrm>
+                    <a:prstGeom prst="rect">
+                      <a:avLst/>
+                    </a:prstGeom>
+                  </pic:spPr>
+                </pic:pic>
+              </a:graphicData>
+            </a:graphic>
+          </wp:inline>
+        </w:drawing>
+      </w:r>
+    </w:p>
+    <w:p>
+      <w:pPr>
+        <w:pStyle w:val="a7"/>
+        <w:numPr>
+          <w:ilvl w:val="0"/>
+          <w:numId w:val="7"/>
+        </w:numPr>
+        <w:spacing w:line="240" w:lineRule="auto"/>
+        <w:rPr>
+          <w:rFonts w:ascii="Times New Roman" w:hAnsi="Times New Roman" w:cs="Times New Roman"/>
+          <w:bCs/>
+          <w:iCs/>
+          <w:color w:val="000000"/>
+          <w:sz w:val="24"/>
+          <w:szCs w:val="24"/>
+        </w:rPr>
+      </w:pPr>
+      <w:r>
+        <w:rPr>
+          <w:rFonts w:ascii="Times New Roman" w:hAnsi="Times New Roman" w:cs="Times New Roman"/>
+          <w:bCs/>
+          <w:iCs/>
+          <w:color w:val="000000"/>
+          <w:sz w:val="24"/>
+          <w:szCs w:val="24"/>
+        </w:rPr>
+        <w:lastRenderedPageBreak/>
+        <w:t>•</w:t>
+      </w:r>
+      <w:r>
+        <w:rPr>
+          <w:rFonts w:ascii="Times New Roman" w:hAnsi="Times New Roman" w:cs="Times New Roman"/>
+          <w:bCs/>
+          <w:iCs/>
+          <w:color w:val="000000"/>
+          <w:sz w:val="24"/>
+          <w:szCs w:val="24"/>
+        </w:rPr>
+        <w:tab/>
+        <w:t>Отправка изменений в удалённый репозиторий</w:t>
+      </w:r>
+      <w:r>
+        <w:rPr>
+          <w:rFonts w:ascii="Times New Roman" w:hAnsi="Times New Roman" w:cs="Times New Roman"/>
+          <w:bCs/>
+          <w:iCs/>
+          <w:color w:val="000000"/>
+          <w:sz w:val="24"/>
+          <w:szCs w:val="24"/>
+        </w:rPr>
+        <w:t>:</w:t>
+      </w:r>
+    </w:p>
+    <w:p>
+      <w:pPr>
+        <w:pStyle w:val="a7"/>
+        <w:spacing w:line="240" w:lineRule="auto"/>
+        <w:ind w:left="-207"/>
+        <w:jc w:val="center"/>
+        <w:rPr>
+          <w:rFonts w:ascii="Times New Roman" w:hAnsi="Times New Roman" w:cs="Times New Roman"/>
+          <w:bCs/>
+          <w:iCs/>
+          <w:color w:val="000000"/>
+          <w:sz w:val="24"/>
+          <w:szCs w:val="24"/>
+          <w:lang w:val="en-US"/>
+        </w:rPr>
+      </w:pPr>
+      <w:r>
+        <w:rPr>
+          <w:rFonts w:ascii="Times New Roman" w:hAnsi="Times New Roman" w:cs="Times New Roman"/>
+          <w:bCs/>
+          <w:iCs/>
+          <w:noProof/>
+          <w:color w:val="000000"/>
+          <w:sz w:val="24"/>
+          <w:szCs w:val="24"/>
+          <w:lang w:val="en-US"/>
+        </w:rPr>
+        <w:drawing>
+          <wp:inline distT="0" distB="0" distL="0" distR="0" wp14:anchorId="28769ACD" wp14:editId="5A40DA15">
+            <wp:extent cx="5940425" cy="2689860"/>
+            <wp:effectExtent l="0" t="0" r="3175" b="0"/>
+            <wp:docPr id="1346324127" name="Рисунок 1"/>
+            <wp:cNvGraphicFramePr>
+              <a:graphicFrameLocks xmlns:a="http://schemas.openxmlformats.org/drawingml/2006/main" noChangeAspect="1"/>
+            </wp:cNvGraphicFramePr>
+            <a:graphic xmlns:a="http://schemas.openxmlformats.org/drawingml/2006/main">
+              <a:graphicData uri="http://schemas.openxmlformats.org/drawingml/2006/picture">
+                <pic:pic xmlns:pic="http://schemas.openxmlformats.org/drawingml/2006/picture">
+                  <pic:nvPicPr>
+                    <pic:cNvPr id="1346324127" name=""/>
+                    <pic:cNvPicPr/>
+                  </pic:nvPicPr>
+                  <pic:blipFill>
+                    <a:blip r:embed="rId18"/>
+                    <a:stretch>
+                      <a:fillRect/>
+                    </a:stretch>
+                  </pic:blipFill>
+                  <pic:spPr>
+                    <a:xfrm>
+                      <a:off x="0" y="0"/>
+                      <a:ext cx="5940425" cy="2689860"/>
+                    </a:xfrm>
+                    <a:prstGeom prst="rect">
+                      <a:avLst/>
+                    </a:prstGeom>
+                  </pic:spPr>
+                </pic:pic>
+              </a:graphicData>
+            </a:graphic>
+          </wp:inline>
+        </w:drawing>
+      </w:r>
+    </w:p>
+    <w:p>
+      <w:pPr>
+        <w:pStyle w:val="a7"/>
+        <w:numPr>
+          <w:ilvl w:val="0"/>
+          <w:numId w:val="7"/>
+        </w:numPr>
+        <w:spacing w:line="240" w:lineRule="auto"/>
+        <w:rPr>
+          <w:rFonts w:ascii="Times New Roman" w:hAnsi="Times New Roman" w:cs="Times New Roman"/>
+          <w:bCs/>
+          <w:iCs/>
+          <w:color w:val="000000"/>
+          <w:sz w:val="24"/>
+          <w:szCs w:val="24"/>
+        </w:rPr>
+      </w:pPr>
+      <w:r>
+        <w:rPr>
+          <w:rFonts w:ascii="Times New Roman" w:hAnsi="Times New Roman" w:cs="Times New Roman"/>
+          <w:bCs/>
+          <w:iCs/>
+          <w:color w:val="000000"/>
+          <w:sz w:val="24"/>
+          <w:szCs w:val="24"/>
+        </w:rPr>
+        <w:t xml:space="preserve">Вносим изменения в </w:t>
+      </w:r>
+      <w:r>
+        <w:rPr>
+          <w:rFonts w:ascii="Times New Roman" w:hAnsi="Times New Roman" w:cs="Times New Roman"/>
+          <w:bCs/>
+          <w:iCs/>
+          <w:color w:val="000000"/>
+          <w:sz w:val="24"/>
+          <w:szCs w:val="24"/>
+          <w:lang w:val="en-US"/>
+        </w:rPr>
+        <w:t>test</w:t>
+      </w:r>
+      <w:r>
+        <w:rPr>
+          <w:rFonts w:ascii="Times New Roman" w:hAnsi="Times New Roman" w:cs="Times New Roman"/>
+          <w:bCs/>
+          <w:iCs/>
+          <w:color w:val="000000"/>
+          <w:sz w:val="24"/>
+          <w:szCs w:val="24"/>
+        </w:rPr>
+        <w:t>.</w:t>
+      </w:r>
+      <w:r>
+        <w:rPr>
+          <w:rFonts w:ascii="Times New Roman" w:hAnsi="Times New Roman" w:cs="Times New Roman"/>
+          <w:bCs/>
+          <w:iCs/>
+          <w:color w:val="000000"/>
+          <w:sz w:val="24"/>
+          <w:szCs w:val="24"/>
+          <w:lang w:val="en-US"/>
+        </w:rPr>
+        <w:t>txt</w:t>
+      </w:r>
+      <w:r>
+        <w:rPr>
+          <w:rFonts w:ascii="Times New Roman" w:hAnsi="Times New Roman" w:cs="Times New Roman"/>
+          <w:bCs/>
+          <w:iCs/>
+          <w:color w:val="000000"/>
+          <w:sz w:val="24"/>
+          <w:szCs w:val="24"/>
+        </w:rPr>
+        <w:t xml:space="preserve"> </w:t>
+      </w:r>
+      <w:r>
+        <w:rPr>
+          <w:rFonts w:ascii="Times New Roman" w:hAnsi="Times New Roman" w:cs="Times New Roman"/>
+          <w:bCs/>
+          <w:iCs/>
+          <w:color w:val="000000"/>
+          <w:sz w:val="24"/>
+          <w:szCs w:val="24"/>
+        </w:rPr>
+        <w:t xml:space="preserve">в папке </w:t>
+      </w:r>
+      <w:r>
+        <w:rPr>
+          <w:rFonts w:ascii="Times New Roman" w:hAnsi="Times New Roman" w:cs="Times New Roman"/>
+          <w:bCs/>
+          <w:iCs/>
+          <w:color w:val="000000"/>
+          <w:sz w:val="24"/>
+          <w:szCs w:val="24"/>
+          <w:lang w:val="en-US"/>
+        </w:rPr>
+        <w:t>Lr</w:t>
+      </w:r>
+      <w:r>
+        <w:rPr>
+          <w:rFonts w:ascii="Times New Roman" w:hAnsi="Times New Roman" w:cs="Times New Roman"/>
+          <w:bCs/>
+          <w:iCs/>
+          <w:color w:val="000000"/>
+          <w:sz w:val="24"/>
+          <w:szCs w:val="24"/>
+        </w:rPr>
+        <w:t>1</w:t>
+      </w:r>
+      <w:r>
+        <w:rPr>
+          <w:rFonts w:ascii="Times New Roman" w:hAnsi="Times New Roman" w:cs="Times New Roman"/>
+          <w:bCs/>
+          <w:iCs/>
+          <w:color w:val="000000"/>
+          <w:sz w:val="24"/>
+          <w:szCs w:val="24"/>
+        </w:rPr>
+        <w:t xml:space="preserve"> через веб-интерфейс </w:t>
+      </w:r>
+      <w:r>
+        <w:rPr>
+          <w:rFonts w:ascii="Times New Roman" w:hAnsi="Times New Roman" w:cs="Times New Roman"/>
+          <w:bCs/>
+          <w:iCs/>
+          <w:color w:val="000000"/>
+          <w:sz w:val="24"/>
+          <w:szCs w:val="24"/>
+          <w:lang w:val="en-US"/>
+        </w:rPr>
+        <w:t>GitHub</w:t>
+      </w:r>
+      <w:r>
+        <w:rPr>
+          <w:rFonts w:ascii="Times New Roman" w:hAnsi="Times New Roman" w:cs="Times New Roman"/>
+          <w:bCs/>
+          <w:iCs/>
+          <w:color w:val="000000"/>
+          <w:sz w:val="24"/>
+          <w:szCs w:val="24"/>
+        </w:rPr>
+        <w:t xml:space="preserve"> </w:t>
+      </w:r>
+      <w:r>
+        <w:rPr>
+          <w:rFonts w:ascii="Times New Roman" w:hAnsi="Times New Roman" w:cs="Times New Roman"/>
+          <w:bCs/>
+          <w:iCs/>
+          <w:color w:val="000000"/>
+          <w:sz w:val="24"/>
+          <w:szCs w:val="24"/>
+        </w:rPr>
+        <w:t xml:space="preserve">и делаем </w:t>
+      </w:r>
+      <w:r>
+        <w:rPr>
+          <w:rFonts w:ascii="Times New Roman" w:hAnsi="Times New Roman" w:cs="Times New Roman"/>
+          <w:bCs/>
+          <w:iCs/>
+          <w:color w:val="000000"/>
+          <w:sz w:val="24"/>
+          <w:szCs w:val="24"/>
+          <w:lang w:val="en-US"/>
+        </w:rPr>
+        <w:t>commit</w:t>
+      </w:r>
+      <w:r>
+        <w:rPr>
+          <w:rFonts w:ascii="Times New Roman" w:hAnsi="Times New Roman" w:cs="Times New Roman"/>
+          <w:bCs/>
+          <w:iCs/>
+          <w:color w:val="000000"/>
+          <w:sz w:val="24"/>
+          <w:szCs w:val="24"/>
+        </w:rPr>
+        <w:t>:</w:t>
+      </w:r>
+    </w:p>
+    <w:p>
+      <w:pPr>
+        <w:pStyle w:val="a7"/>
+        <w:spacing w:line="240" w:lineRule="auto"/>
+        <w:ind w:left="-207"/>
+        <w:rPr>
+          <w:rFonts w:ascii="Times New Roman" w:hAnsi="Times New Roman" w:cs="Times New Roman"/>
+          <w:bCs/>
+          <w:iCs/>
+          <w:color w:val="000000"/>
+          <w:sz w:val="24"/>
+          <w:szCs w:val="24"/>
+        </w:rPr>
+      </w:pPr>
+      <w:r>
+        <w:rPr>
+          <w:rFonts w:ascii="Times New Roman" w:hAnsi="Times New Roman" w:cs="Times New Roman"/>
+          <w:bCs/>
+          <w:iCs/>
+          <w:noProof/>
+          <w:color w:val="000000"/>
+          <w:sz w:val="24"/>
+          <w:szCs w:val="24"/>
+        </w:rPr>
+        <w:drawing>
+          <wp:inline distT="0" distB="0" distL="0" distR="0" wp14:anchorId="38F03F3F" wp14:editId="6A8E029C">
+            <wp:extent cx="5940425" cy="792480"/>
+            <wp:effectExtent l="0" t="0" r="3175" b="7620"/>
+            <wp:docPr id="795591945" name="Рисунок 1"/>
+            <wp:cNvGraphicFramePr>
+              <a:graphicFrameLocks xmlns:a="http://schemas.openxmlformats.org/drawingml/2006/main" noChangeAspect="1"/>
+            </wp:cNvGraphicFramePr>
+            <a:graphic xmlns:a="http://schemas.openxmlformats.org/drawingml/2006/main">
+              <a:graphicData uri="http://schemas.openxmlformats.org/drawingml/2006/picture">
+                <pic:pic xmlns:pic="http://schemas.openxmlformats.org/drawingml/2006/picture">
+                  <pic:nvPicPr>
+                    <pic:cNvPr id="795591945" name=""/>
+                    <pic:cNvPicPr/>
+                  </pic:nvPicPr>
+                  <pic:blipFill>
+                    <a:blip r:embed="rId19"/>
+                    <a:stretch>
+                      <a:fillRect/>
+                    </a:stretch>
+                  </pic:blipFill>
+                  <pic:spPr>
+                    <a:xfrm>
+                      <a:off x="0" y="0"/>
+                      <a:ext cx="5940425" cy="792480"/>
+                    </a:xfrm>
+                    <a:prstGeom prst="rect">
+                      <a:avLst/>
+                    </a:prstGeom>
+                  </pic:spPr>
+                </pic:pic>
+              </a:graphicData>
+            </a:graphic>
+          </wp:inline>
+        </w:drawing>
+      </w:r>
+    </w:p>
+    <w:p>
+      <w:pPr>
+        <w:pStyle w:val="a7"/>
+        <w:numPr>
+          <w:ilvl w:val="0"/>
+          <w:numId w:val="7"/>
+        </w:numPr>
+        <w:spacing w:line="240" w:lineRule="auto"/>
+        <w:rPr>
+          <w:rFonts w:ascii="Times New Roman" w:hAnsi="Times New Roman" w:cs="Times New Roman"/>
+          <w:bCs/>
+          <w:iCs/>
+          <w:color w:val="000000"/>
+          <w:sz w:val="24"/>
+          <w:szCs w:val="24"/>
+        </w:rPr>
+      </w:pPr>
+      <w:r>
+        <w:rPr>
+          <w:rFonts w:ascii="Times New Roman" w:eastAsia="Times New Roman" w:hAnsi="Times New Roman"/>
+          <w:sz w:val="24"/>
+          <w:szCs w:val="24"/>
+          <w:lang w:eastAsia="ru-RU"/>
+        </w:rPr>
+        <w:t>П</w:t>
+      </w:r>
+      <w:r>
+        <w:rPr>
+          <w:rFonts w:ascii="Times New Roman" w:eastAsia="Times New Roman" w:hAnsi="Times New Roman"/>
+          <w:sz w:val="24"/>
+          <w:szCs w:val="24"/>
+          <w:lang w:eastAsia="ru-RU"/>
+        </w:rPr>
+        <w:t>олуч</w:t>
+      </w:r>
+      <w:r>
+        <w:rPr>
+          <w:rFonts w:ascii="Times New Roman" w:eastAsia="Times New Roman" w:hAnsi="Times New Roman"/>
+          <w:sz w:val="24"/>
+          <w:szCs w:val="24"/>
+          <w:lang w:eastAsia="ru-RU"/>
+        </w:rPr>
+        <w:t>аем</w:t>
+      </w:r>
+      <w:r>
+        <w:rPr>
+          <w:rFonts w:ascii="Times New Roman" w:eastAsia="Times New Roman" w:hAnsi="Times New Roman"/>
+          <w:sz w:val="24"/>
+          <w:szCs w:val="24"/>
+          <w:lang w:eastAsia="ru-RU"/>
+        </w:rPr>
+        <w:t xml:space="preserve"> изменения из главного репозитория</w:t>
+      </w:r>
+      <w:r>
+        <w:rPr>
+          <w:rFonts w:ascii="Times New Roman" w:eastAsia="Times New Roman" w:hAnsi="Times New Roman"/>
+          <w:sz w:val="24"/>
+          <w:szCs w:val="24"/>
+          <w:lang w:eastAsia="ru-RU"/>
+        </w:rPr>
+        <w:t xml:space="preserve"> в локальный:</w:t>
+      </w:r>
+    </w:p>
+    <w:p>
+      <w:pPr>
+        <w:pStyle w:val="a7"/>
+        <w:spacing w:line="240" w:lineRule="auto"/>
+        <w:ind w:left="-207"/>
+        <w:jc w:val="center"/>
+        <w:rPr>
+          <w:rFonts w:ascii="Times New Roman" w:hAnsi="Times New Roman" w:cs="Times New Roman"/>
+          <w:bCs/>
+          <w:iCs/>
+          <w:color w:val="000000"/>
+          <w:sz w:val="24"/>
+          <w:szCs w:val="24"/>
+          <w:lang w:val="en-US"/>
+        </w:rPr>
+      </w:pPr>
+      <w:r>
+        <w:rPr>
+          <w:rFonts w:ascii="Times New Roman" w:hAnsi="Times New Roman" w:cs="Times New Roman"/>
+          <w:bCs/>
+          <w:iCs/>
+          <w:noProof/>
+          <w:color w:val="000000"/>
+          <w:sz w:val="24"/>
+          <w:szCs w:val="24"/>
+          <w:lang w:val="en-US"/>
+        </w:rPr>
+        <w:drawing>
+          <wp:inline distT="0" distB="0" distL="0" distR="0" wp14:anchorId="2BF06EC4" wp14:editId="1328121A">
+            <wp:extent cx="5940425" cy="2438400"/>
+            <wp:effectExtent l="0" t="0" r="3175" b="0"/>
+            <wp:docPr id="112136789" name="Рисунок 1"/>
+            <wp:cNvGraphicFramePr>
+              <a:graphicFrameLocks xmlns:a="http://schemas.openxmlformats.org/drawingml/2006/main" noChangeAspect="1"/>
+            </wp:cNvGraphicFramePr>
+            <a:graphic xmlns:a="http://schemas.openxmlformats.org/drawingml/2006/main">
+              <a:graphicData uri="http://schemas.openxmlformats.org/drawingml/2006/picture">
+                <pic:pic xmlns:pic="http://schemas.openxmlformats.org/drawingml/2006/picture">
+                  <pic:nvPicPr>
+                    <pic:cNvPr id="112136789" name=""/>
+                    <pic:cNvPicPr/>
+                  </pic:nvPicPr>
+                  <pic:blipFill>
+                    <a:blip r:embed="rId20"/>
+                    <a:stretch>
+                      <a:fillRect/>
+                    </a:stretch>
+                  </pic:blipFill>
+                  <pic:spPr>
+                    <a:xfrm>
+                      <a:off x="0" y="0"/>
+                      <a:ext cx="5940425" cy="2438400"/>
+                    </a:xfrm>
+                    <a:prstGeom prst="rect">
+                      <a:avLst/>
+                    </a:prstGeom>
+                  </pic:spPr>
+                </pic:pic>
+              </a:graphicData>
+            </a:graphic>
+          </wp:inline>
+        </w:drawing>
+      </w:r>
+    </w:p>
+    <w:p>
+      <w:pPr>
+        <w:pStyle w:val="a7"/>
+        <w:numPr>
+          <w:ilvl w:val="0"/>
+          <w:numId w:val="7"/>
+        </w:numPr>
+        <w:spacing w:line="240" w:lineRule="auto"/>
+        <w:rPr>
+          <w:rFonts w:ascii="Times New Roman" w:hAnsi="Times New Roman" w:cs="Times New Roman"/>
+          <w:bCs/>
+          <w:iCs/>
+          <w:color w:val="000000"/>
+          <w:sz w:val="24"/>
+          <w:szCs w:val="24"/>
+        </w:rPr>
+      </w:pPr>
+      <w:r>
+        <w:rPr>
+          <w:rFonts w:ascii="Times New Roman" w:hAnsi="Times New Roman" w:cs="Times New Roman"/>
+          <w:bCs/>
+          <w:iCs/>
+          <w:color w:val="000000"/>
+          <w:sz w:val="24"/>
+          <w:szCs w:val="24"/>
+        </w:rPr>
+        <w:t xml:space="preserve">Вносим изменения в этот же файл </w:t>
+      </w:r>
+      <w:r>
+        <w:rPr>
+          <w:rFonts w:ascii="Times New Roman" w:hAnsi="Times New Roman" w:cs="Times New Roman"/>
+          <w:bCs/>
+          <w:iCs/>
+          <w:color w:val="000000"/>
+          <w:sz w:val="24"/>
+          <w:szCs w:val="24"/>
+          <w:lang w:val="en-US"/>
+        </w:rPr>
+        <w:t>test</w:t>
+      </w:r>
+      <w:r>
+        <w:rPr>
+          <w:rFonts w:ascii="Times New Roman" w:hAnsi="Times New Roman" w:cs="Times New Roman"/>
+          <w:bCs/>
+          <w:iCs/>
+          <w:color w:val="000000"/>
+          <w:sz w:val="24"/>
+          <w:szCs w:val="24"/>
+        </w:rPr>
+        <w:t>.</w:t>
+      </w:r>
+      <w:r>
+        <w:rPr>
+          <w:rFonts w:ascii="Times New Roman" w:hAnsi="Times New Roman" w:cs="Times New Roman"/>
+          <w:bCs/>
+          <w:iCs/>
+          <w:color w:val="000000"/>
+          <w:sz w:val="24"/>
+          <w:szCs w:val="24"/>
+          <w:lang w:val="en-US"/>
+        </w:rPr>
+        <w:t>txt</w:t>
+      </w:r>
+      <w:r>
+        <w:rPr>
+          <w:rFonts w:ascii="Times New Roman" w:hAnsi="Times New Roman" w:cs="Times New Roman"/>
+          <w:bCs/>
+          <w:iCs/>
+          <w:color w:val="000000"/>
+          <w:sz w:val="24"/>
+          <w:szCs w:val="24"/>
+        </w:rPr>
+        <w:t xml:space="preserve"> </w:t>
+      </w:r>
+      <w:r>
+        <w:rPr>
+          <w:rFonts w:ascii="Times New Roman" w:hAnsi="Times New Roman" w:cs="Times New Roman"/>
+          <w:bCs/>
+          <w:iCs/>
+          <w:color w:val="000000"/>
+          <w:sz w:val="24"/>
+          <w:szCs w:val="24"/>
+        </w:rPr>
+        <w:t xml:space="preserve">в папке </w:t>
+      </w:r>
+      <w:r>
+        <w:rPr>
+          <w:rFonts w:ascii="Times New Roman" w:hAnsi="Times New Roman" w:cs="Times New Roman"/>
+          <w:bCs/>
+          <w:iCs/>
+          <w:color w:val="000000"/>
+          <w:sz w:val="24"/>
+          <w:szCs w:val="24"/>
+          <w:lang w:val="en-US"/>
+        </w:rPr>
+        <w:t>Lr</w:t>
+      </w:r>
+      <w:r>
+        <w:rPr>
+          <w:rFonts w:ascii="Times New Roman" w:hAnsi="Times New Roman" w:cs="Times New Roman"/>
+          <w:bCs/>
+          <w:iCs/>
+          <w:color w:val="000000"/>
+          <w:sz w:val="24"/>
+          <w:szCs w:val="24"/>
+        </w:rPr>
+        <w:t>1</w:t>
+      </w:r>
+      <w:r>
+        <w:rPr>
+          <w:rFonts w:ascii="Times New Roman" w:hAnsi="Times New Roman" w:cs="Times New Roman"/>
+          <w:bCs/>
+          <w:iCs/>
+          <w:color w:val="000000"/>
+          <w:sz w:val="24"/>
+          <w:szCs w:val="24"/>
+        </w:rPr>
+        <w:t>, но на этот раз локально:</w:t>
+      </w:r>
+    </w:p>
+    <w:p>
+      <w:pPr>
+        <w:pStyle w:val="a7"/>
+        <w:spacing w:line="240" w:lineRule="auto"/>
+        <w:ind w:left="-207"/>
+        <w:jc w:val="center"/>
+        <w:rPr>
+          <w:rFonts w:ascii="Times New Roman" w:hAnsi="Times New Roman" w:cs="Times New Roman"/>
+          <w:bCs/>
+          <w:iCs/>
+          <w:color w:val="000000"/>
+          <w:sz w:val="24"/>
+          <w:szCs w:val="24"/>
+          <w:lang w:val="en-US"/>
+        </w:rPr>
+      </w:pPr>
+      <w:r>
+        <w:rPr>
+          <w:rFonts w:ascii="Times New Roman" w:hAnsi="Times New Roman" w:cs="Times New Roman"/>
+          <w:bCs/>
+          <w:iCs/>
+          <w:noProof/>
+          <w:color w:val="000000"/>
+          <w:sz w:val="24"/>
+          <w:szCs w:val="24"/>
+          <w:lang w:val="en-US"/>
+        </w:rPr>
+        <w:drawing>
+          <wp:inline distT="0" distB="0" distL="0" distR="0" wp14:anchorId="32637DAF" wp14:editId="5645E88B">
+            <wp:extent cx="5940425" cy="2537460"/>
+            <wp:effectExtent l="0" t="0" r="3175" b="0"/>
+            <wp:docPr id="827257621" name="Рисунок 1"/>
+            <wp:cNvGraphicFramePr>
+              <a:graphicFrameLocks xmlns:a="http://schemas.openxmlformats.org/drawingml/2006/main" noChangeAspect="1"/>
+            </wp:cNvGraphicFramePr>
+            <a:graphic xmlns:a="http://schemas.openxmlformats.org/drawingml/2006/main">
+              <a:graphicData uri="http://schemas.openxmlformats.org/drawingml/2006/picture">
+                <pic:pic xmlns:pic="http://schemas.openxmlformats.org/drawingml/2006/picture">
+                  <pic:nvPicPr>
+                    <pic:cNvPr id="827257621" name=""/>
+                    <pic:cNvPicPr/>
+                  </pic:nvPicPr>
+                  <pic:blipFill>
+                    <a:blip r:embed="rId21"/>
+                    <a:stretch>
+                      <a:fillRect/>
+                    </a:stretch>
+                  </pic:blipFill>
+                  <pic:spPr>
+                    <a:xfrm>
+                      <a:off x="0" y="0"/>
+                      <a:ext cx="5940425" cy="2537460"/>
+                    </a:xfrm>
+                    <a:prstGeom prst="rect">
+                      <a:avLst/>
+                    </a:prstGeom>
+                  </pic:spPr>
+                </pic:pic>
+              </a:graphicData>
+            </a:graphic>
+          </wp:inline>
+        </w:drawing>
+      </w:r>
+    </w:p>
+    <w:p>
+      <w:pPr>
+        <w:pStyle w:val="a7"/>
+        <w:numPr>
+          <w:ilvl w:val="0"/>
+          <w:numId w:val="7"/>
+        </w:numPr>
+        <w:spacing w:line="240" w:lineRule="auto"/>
+        <w:rPr>
+          <w:rFonts w:ascii="Times New Roman" w:hAnsi="Times New Roman" w:cs="Times New Roman"/>
+          <w:bCs/>
+          <w:iCs/>
+          <w:color w:val="000000"/>
+          <w:sz w:val="24"/>
+          <w:szCs w:val="24"/>
+        </w:rPr>
+      </w:pPr>
+      <w:r>
+        <w:rPr>
+          <w:rFonts w:ascii="Times New Roman" w:hAnsi="Times New Roman" w:cs="Times New Roman"/>
+          <w:bCs/>
+          <w:iCs/>
+          <w:color w:val="000000"/>
+          <w:sz w:val="24"/>
+          <w:szCs w:val="24"/>
+        </w:rPr>
+        <w:lastRenderedPageBreak/>
+        <w:t>Получаем ошибку при о</w:t>
+      </w:r>
+      <w:r>
+        <w:rPr>
+          <w:rFonts w:ascii="Times New Roman" w:hAnsi="Times New Roman" w:cs="Times New Roman"/>
+          <w:bCs/>
+          <w:iCs/>
+          <w:color w:val="000000"/>
+          <w:sz w:val="24"/>
+          <w:szCs w:val="24"/>
+        </w:rPr>
+        <w:t>тправк</w:t>
+      </w:r>
+      <w:r>
+        <w:rPr>
+          <w:rFonts w:ascii="Times New Roman" w:hAnsi="Times New Roman" w:cs="Times New Roman"/>
+          <w:bCs/>
+          <w:iCs/>
+          <w:color w:val="000000"/>
+          <w:sz w:val="24"/>
+          <w:szCs w:val="24"/>
+        </w:rPr>
+        <w:t>е</w:t>
+      </w:r>
+      <w:r>
+        <w:rPr>
+          <w:rFonts w:ascii="Times New Roman" w:hAnsi="Times New Roman" w:cs="Times New Roman"/>
+          <w:bCs/>
+          <w:iCs/>
+          <w:color w:val="000000"/>
+          <w:sz w:val="24"/>
+          <w:szCs w:val="24"/>
+        </w:rPr>
+        <w:t xml:space="preserve"> изменений в удалённый репозиторий</w:t>
+      </w:r>
+    </w:p>
+    <w:p>
+      <w:pPr>
+        <w:pStyle w:val="a7"/>
+        <w:spacing w:line="240" w:lineRule="auto"/>
+        <w:ind w:left="-207"/>
+        <w:jc w:val="center"/>
+        <w:rPr>
+          <w:rFonts w:ascii="Times New Roman" w:hAnsi="Times New Roman" w:cs="Times New Roman"/>
+          <w:bCs/>
+          <w:iCs/>
+          <w:color w:val="000000"/>
+          <w:sz w:val="24"/>
+          <w:szCs w:val="24"/>
+        </w:rPr>
+      </w:pPr>
+      <w:r>
+        <w:rPr>
+          <w:rFonts w:ascii="Times New Roman" w:hAnsi="Times New Roman" w:cs="Times New Roman"/>
+          <w:bCs/>
+          <w:iCs/>
+          <w:noProof/>
+          <w:color w:val="000000"/>
+          <w:sz w:val="24"/>
+          <w:szCs w:val="24"/>
+          <w:lang w:val="en-US"/>
+        </w:rPr>
+        <w:drawing>
+          <wp:inline distT="0" distB="0" distL="0" distR="0" wp14:anchorId="77B1C14C" wp14:editId="736B6260">
+            <wp:extent cx="5940425" cy="1729740"/>
+            <wp:effectExtent l="0" t="0" r="3175" b="3810"/>
+            <wp:docPr id="250413324" name="Рисунок 1"/>
+            <wp:cNvGraphicFramePr>
+              <a:graphicFrameLocks xmlns:a="http://schemas.openxmlformats.org/drawingml/2006/main" noChangeAspect="1"/>
+            </wp:cNvGraphicFramePr>
+            <a:graphic xmlns:a="http://schemas.openxmlformats.org/drawingml/2006/main">
+              <a:graphicData uri="http://schemas.openxmlformats.org/drawingml/2006/picture">
+                <pic:pic xmlns:pic="http://schemas.openxmlformats.org/drawingml/2006/picture">
+                  <pic:nvPicPr>
+                    <pic:cNvPr id="250413324" name=""/>
+                    <pic:cNvPicPr/>
+                  </pic:nvPicPr>
+                  <pic:blipFill>
+                    <a:blip r:embed="rId22"/>
+                    <a:stretch>
+                      <a:fillRect/>
+                    </a:stretch>
+                  </pic:blipFill>
+                  <pic:spPr>
+                    <a:xfrm>
+                      <a:off x="0" y="0"/>
+                      <a:ext cx="5940425" cy="1729740"/>
+                    </a:xfrm>
+                    <a:prstGeom prst="rect">
+                      <a:avLst/>
+                    </a:prstGeom>
+                  </pic:spPr>
+                </pic:pic>
+              </a:graphicData>
+            </a:graphic>
+          </wp:inline>
+        </w:drawing>
+      </w:r>
+    </w:p>
+    <w:p>
+      <w:pPr>
+        <w:pStyle w:val="a7"/>
+        <w:numPr>
+          <w:ilvl w:val="0"/>
+          <w:numId w:val="7"/>
+        </w:numPr>
+        <w:spacing w:line="240" w:lineRule="auto"/>
+        <w:rPr>
+          <w:rFonts w:ascii="Times New Roman" w:hAnsi="Times New Roman" w:cs="Times New Roman"/>
+          <w:bCs/>
+          <w:iCs/>
+          <w:color w:val="000000"/>
+          <w:sz w:val="24"/>
+          <w:szCs w:val="24"/>
+        </w:rPr>
+      </w:pPr>
+      <w:r>
+        <w:rPr>
+          <w:rFonts w:ascii="Times New Roman" w:hAnsi="Times New Roman" w:cs="Times New Roman"/>
+          <w:bCs/>
+          <w:iCs/>
+          <w:color w:val="000000"/>
+          <w:sz w:val="24"/>
+          <w:szCs w:val="24"/>
+        </w:rPr>
+        <w:t xml:space="preserve">Ошибка при попытке автоматически </w:t>
+      </w:r>
+      <w:r>
+        <w:rPr>
+          <w:rFonts w:ascii="Times New Roman" w:hAnsi="Times New Roman" w:cs="Times New Roman"/>
+          <w:bCs/>
+          <w:iCs/>
+          <w:color w:val="000000"/>
+          <w:sz w:val="24"/>
+          <w:szCs w:val="24"/>
+        </w:rPr>
+        <w:t xml:space="preserve">объединить удаленные изменения </w:t>
+      </w:r>
+      <w:r>
+        <w:rPr>
+          <w:rFonts w:ascii="Times New Roman" w:hAnsi="Times New Roman" w:cs="Times New Roman"/>
+          <w:bCs/>
+          <w:iCs/>
+          <w:color w:val="000000"/>
+          <w:sz w:val="24"/>
+          <w:szCs w:val="24"/>
+        </w:rPr>
+        <w:t>с локальными</w:t>
+      </w:r>
+    </w:p>
+    <w:p>
+      <w:pPr>
+        <w:pStyle w:val="a7"/>
+        <w:spacing w:line="240" w:lineRule="auto"/>
+        <w:ind w:left="-207"/>
+        <w:jc w:val="center"/>
+        <w:rPr>
+          <w:rFonts w:ascii="Times New Roman" w:hAnsi="Times New Roman" w:cs="Times New Roman"/>
+          <w:bCs/>
+          <w:iCs/>
+          <w:color w:val="000000"/>
+          <w:sz w:val="24"/>
+          <w:szCs w:val="24"/>
+        </w:rPr>
+      </w:pPr>
+      <w:r>
+        <w:rPr>
+          <w:rFonts w:ascii="Times New Roman" w:hAnsi="Times New Roman" w:cs="Times New Roman"/>
+          <w:bCs/>
+          <w:iCs/>
+          <w:noProof/>
+          <w:color w:val="000000"/>
+          <w:sz w:val="24"/>
+          <w:szCs w:val="24"/>
+        </w:rPr>
+        <w:drawing>
+          <wp:inline distT="0" distB="0" distL="0" distR="0" wp14:anchorId="52AE2AB7" wp14:editId="4C3218F7">
+            <wp:extent cx="5940425" cy="1638300"/>
+            <wp:effectExtent l="0" t="0" r="3175" b="0"/>
+            <wp:docPr id="110056176" name="Рисунок 1"/>
+            <wp:cNvGraphicFramePr>
+              <a:graphicFrameLocks xmlns:a="http://schemas.openxmlformats.org/drawingml/2006/main" noChangeAspect="1"/>
+            </wp:cNvGraphicFramePr>
+            <a:graphic xmlns:a="http://schemas.openxmlformats.org/drawingml/2006/main">
+              <a:graphicData uri="http://schemas.openxmlformats.org/drawingml/2006/picture">
+                <pic:pic xmlns:pic="http://schemas.openxmlformats.org/drawingml/2006/picture">
+                  <pic:nvPicPr>
+                    <pic:cNvPr id="110056176" name=""/>
+                    <pic:cNvPicPr/>
+                  </pic:nvPicPr>
+                  <pic:blipFill>
+                    <a:blip r:embed="rId23"/>
+                    <a:stretch>
+                      <a:fillRect/>
+                    </a:stretch>
+                  </pic:blipFill>
+                  <pic:spPr>
+                    <a:xfrm>
+                      <a:off x="0" y="0"/>
+                      <a:ext cx="5940425" cy="1638300"/>
+                    </a:xfrm>
+                    <a:prstGeom prst="rect">
+                      <a:avLst/>
+                    </a:prstGeom>
+                  </pic:spPr>
+                </pic:pic>
+              </a:graphicData>
+            </a:graphic>
+          </wp:inline>
+        </w:drawing>
+      </w:r>
+    </w:p>
+    <w:p>
+      <w:pPr>
+        <w:pStyle w:val="a7"/>
+        <w:spacing w:line="240" w:lineRule="auto"/>
+        <w:ind w:left="-207"/>
+        <w:rPr>
+          <w:rFonts w:ascii="Times New Roman" w:hAnsi="Times New Roman" w:cs="Times New Roman"/>
+          <w:bCs/>
+          <w:iCs/>
+          <w:color w:val="000000"/>
+          <w:sz w:val="24"/>
+          <w:szCs w:val="24"/>
+        </w:rPr>
+      </w:pPr>
+    </w:p>
+    <w:p>
+      <w:pPr>
+        <w:pStyle w:val="a7"/>
+        <w:spacing w:line="240" w:lineRule="auto"/>
+        <w:ind w:left="-207"/>
+        <w:jc w:val="center"/>
+        <w:rPr>
+          <w:rFonts w:ascii="Times New Roman" w:hAnsi="Times New Roman" w:cs="Times New Roman"/>
+          <w:bCs/>
+          <w:iCs/>
+          <w:color w:val="000000"/>
+          <w:sz w:val="24"/>
+          <w:szCs w:val="24"/>
+        </w:rPr>
+      </w:pPr>
+      <w:r>
+        <w:rPr>
+          <w:rFonts w:ascii="Times New Roman" w:hAnsi="Times New Roman" w:cs="Times New Roman"/>
+          <w:bCs/>
+          <w:iCs/>
+          <w:noProof/>
+          <w:color w:val="000000"/>
+          <w:sz w:val="24"/>
+          <w:szCs w:val="24"/>
+        </w:rPr>
+        <w:drawing>
+          <wp:inline distT="0" distB="0" distL="0" distR="0" wp14:anchorId="3F9B45CF" wp14:editId="2A5C53B7">
+            <wp:extent cx="5940425" cy="1592580"/>
+            <wp:effectExtent l="0" t="0" r="3175" b="7620"/>
+            <wp:docPr id="1377208417" name="Рисунок 1"/>
+            <wp:cNvGraphicFramePr>
+              <a:graphicFrameLocks xmlns:a="http://schemas.openxmlformats.org/drawingml/2006/main" noChangeAspect="1"/>
+            </wp:cNvGraphicFramePr>
+            <a:graphic xmlns:a="http://schemas.openxmlformats.org/drawingml/2006/main">
+              <a:graphicData uri="http://schemas.openxmlformats.org/drawingml/2006/picture">
+                <pic:pic xmlns:pic="http://schemas.openxmlformats.org/drawingml/2006/picture">
+                  <pic:nvPicPr>
+                    <pic:cNvPr id="1377208417" name=""/>
+                    <pic:cNvPicPr/>
+                  </pic:nvPicPr>
+                  <pic:blipFill>
+                    <a:blip r:embed="rId24"/>
+                    <a:stretch>
+                      <a:fillRect/>
+                    </a:stretch>
+                  </pic:blipFill>
+                  <pic:spPr>
+                    <a:xfrm>
+                      <a:off x="0" y="0"/>
+                      <a:ext cx="5940425" cy="1592580"/>
+                    </a:xfrm>
+                    <a:prstGeom prst="rect">
+                      <a:avLst/>
+                    </a:prstGeom>
+                  </pic:spPr>
+                </pic:pic>
+              </a:graphicData>
+            </a:graphic>
+          </wp:inline>
+        </w:drawing>
+      </w:r>
+    </w:p>
+    <w:p>
+      <w:pPr>
+        <w:pStyle w:val="a7"/>
+        <w:numPr>
+          <w:ilvl w:val="0"/>
+          <w:numId w:val="7"/>
+        </w:numPr>
+        <w:spacing w:line="240" w:lineRule="auto"/>
+        <w:rPr>
+          <w:rFonts w:ascii="Times New Roman" w:hAnsi="Times New Roman" w:cs="Times New Roman"/>
+          <w:bCs/>
+          <w:iCs/>
+          <w:color w:val="000000"/>
+          <w:sz w:val="24"/>
+          <w:szCs w:val="24"/>
+        </w:rPr>
+      </w:pPr>
+      <w:r>
+        <w:rPr>
+          <w:rFonts w:ascii="Times New Roman" w:hAnsi="Times New Roman" w:cs="Times New Roman"/>
+          <w:bCs/>
+          <w:iCs/>
+          <w:color w:val="000000"/>
+          <w:sz w:val="24"/>
+          <w:szCs w:val="24"/>
+        </w:rPr>
+        <w:t>Устраняем конфликт и</w:t>
+      </w:r>
+      <w:r>
+        <w:rPr>
+          <w:rFonts w:ascii="Times New Roman" w:hAnsi="Times New Roman" w:cs="Times New Roman"/>
+          <w:bCs/>
+          <w:iCs/>
+          <w:color w:val="000000"/>
+          <w:sz w:val="24"/>
+          <w:szCs w:val="24"/>
+        </w:rPr>
+        <w:t xml:space="preserve"> </w:t>
+      </w:r>
+      <w:r>
+        <w:rPr>
+          <w:rFonts w:ascii="Times New Roman" w:hAnsi="Times New Roman" w:cs="Times New Roman"/>
+          <w:bCs/>
+          <w:iCs/>
+          <w:color w:val="000000"/>
+          <w:sz w:val="24"/>
+          <w:szCs w:val="24"/>
+        </w:rPr>
+        <w:t>о</w:t>
+      </w:r>
+      <w:r>
+        <w:rPr>
+          <w:rFonts w:ascii="Times New Roman" w:hAnsi="Times New Roman" w:cs="Times New Roman"/>
+          <w:bCs/>
+          <w:iCs/>
+          <w:color w:val="000000"/>
+          <w:sz w:val="24"/>
+          <w:szCs w:val="24"/>
+        </w:rPr>
+        <w:t>тправ</w:t>
+      </w:r>
+      <w:r>
+        <w:rPr>
+          <w:rFonts w:ascii="Times New Roman" w:hAnsi="Times New Roman" w:cs="Times New Roman"/>
+          <w:bCs/>
+          <w:iCs/>
+          <w:color w:val="000000"/>
+          <w:sz w:val="24"/>
+          <w:szCs w:val="24"/>
+        </w:rPr>
+        <w:t>ляем</w:t>
+      </w:r>
+      <w:r>
+        <w:rPr>
+          <w:rFonts w:ascii="Times New Roman" w:hAnsi="Times New Roman" w:cs="Times New Roman"/>
+          <w:bCs/>
+          <w:iCs/>
+          <w:color w:val="000000"/>
+          <w:sz w:val="24"/>
+          <w:szCs w:val="24"/>
+        </w:rPr>
+        <w:t xml:space="preserve"> изменени</w:t>
+      </w:r>
+      <w:r>
+        <w:rPr>
+          <w:rFonts w:ascii="Times New Roman" w:hAnsi="Times New Roman" w:cs="Times New Roman"/>
+          <w:bCs/>
+          <w:iCs/>
+          <w:color w:val="000000"/>
+          <w:sz w:val="24"/>
+          <w:szCs w:val="24"/>
+        </w:rPr>
+        <w:t>я</w:t>
+      </w:r>
+      <w:r>
+        <w:rPr>
+          <w:rFonts w:ascii="Times New Roman" w:hAnsi="Times New Roman" w:cs="Times New Roman"/>
+          <w:bCs/>
+          <w:iCs/>
+          <w:color w:val="000000"/>
+          <w:sz w:val="24"/>
+          <w:szCs w:val="24"/>
+        </w:rPr>
+        <w:t xml:space="preserve"> в удалённый репозиторий</w:t>
+      </w:r>
+    </w:p>
+    <w:p>
+      <w:pPr>
+        <w:pStyle w:val="a7"/>
+        <w:spacing w:line="240" w:lineRule="auto"/>
+        <w:ind w:left="-207"/>
+        <w:rPr>
+          <w:rFonts w:ascii="Times New Roman" w:hAnsi="Times New Roman" w:cs="Times New Roman"/>
+          <w:bCs/>
+          <w:iCs/>
+          <w:color w:val="000000"/>
+          <w:sz w:val="24"/>
+          <w:szCs w:val="24"/>
+        </w:rPr>
+      </w:pPr>
+      <w:r>
+        <w:rPr>
+          <w:rFonts w:ascii="Times New Roman" w:hAnsi="Times New Roman" w:cs="Times New Roman"/>
+          <w:bCs/>
+          <w:iCs/>
+          <w:noProof/>
+          <w:color w:val="000000"/>
+          <w:sz w:val="24"/>
+          <w:szCs w:val="24"/>
+        </w:rPr>
+        <w:drawing>
+          <wp:inline distT="0" distB="0" distL="0" distR="0" wp14:anchorId="4622186D" wp14:editId="3F63EA5A">
+            <wp:extent cx="5940425" cy="868680"/>
+            <wp:effectExtent l="0" t="0" r="3175" b="7620"/>
+            <wp:docPr id="557018160" name="Рисунок 1"/>
+            <wp:cNvGraphicFramePr>
+              <a:graphicFrameLocks xmlns:a="http://schemas.openxmlformats.org/drawingml/2006/main" noChangeAspect="1"/>
+            </wp:cNvGraphicFramePr>
+            <a:graphic xmlns:a="http://schemas.openxmlformats.org/drawingml/2006/main">
+              <a:graphicData uri="http://schemas.openxmlformats.org/drawingml/2006/picture">
+                <pic:pic xmlns:pic="http://schemas.openxmlformats.org/drawingml/2006/picture">
+                  <pic:nvPicPr>
+                    <pic:cNvPr id="557018160" name=""/>
+                    <pic:cNvPicPr/>
+                  </pic:nvPicPr>
+                  <pic:blipFill>
+                    <a:blip r:embed="rId25"/>
+                    <a:stretch>
+                      <a:fillRect/>
+                    </a:stretch>
+                  </pic:blipFill>
+                  <pic:spPr>
+                    <a:xfrm>
+                      <a:off x="0" y="0"/>
+                      <a:ext cx="5940425" cy="868680"/>
+                    </a:xfrm>
+                    <a:prstGeom prst="rect">
+                      <a:avLst/>
+                    </a:prstGeom>
+                  </pic:spPr>
+                </pic:pic>
+              </a:graphicData>
+            </a:graphic>
+          </wp:inline>
+        </w:drawing>
+      </w:r>
+    </w:p>
+    <w:p>
+      <w:pPr>
+        <w:pStyle w:val="a7"/>
+        <w:spacing w:line="240" w:lineRule="auto"/>
+        <w:ind w:left="-207"/>
+        <w:rPr>
+          <w:rFonts w:ascii="Times New Roman" w:hAnsi="Times New Roman" w:cs="Times New Roman"/>
+          <w:bCs/>
+          <w:iCs/>
+          <w:color w:val="000000"/>
+          <w:sz w:val="24"/>
+          <w:szCs w:val="24"/>
+          <w:lang w:val="en-US"/>
+        </w:rPr>
+      </w:pPr>
+      <w:r>
+        <w:rPr>
+          <w:rFonts w:ascii="Times New Roman" w:hAnsi="Times New Roman" w:cs="Times New Roman"/>
+          <w:bCs/>
+          <w:iCs/>
+          <w:noProof/>
+          <w:color w:val="000000"/>
+          <w:sz w:val="24"/>
+          <w:szCs w:val="24"/>
+          <w:lang w:val="en-US"/>
+        </w:rPr>
+        <w:drawing>
+          <wp:inline distT="0" distB="0" distL="0" distR="0" wp14:anchorId="658D97AD" wp14:editId="3B432AC1">
+            <wp:extent cx="5940425" cy="2626995"/>
+            <wp:effectExtent l="0" t="0" r="3175" b="1905"/>
+            <wp:docPr id="370018777" name="Рисунок 1"/>
+            <wp:cNvGraphicFramePr>
+              <a:graphicFrameLocks xmlns:a="http://schemas.openxmlformats.org/drawingml/2006/main" noChangeAspect="1"/>
+            </wp:cNvGraphicFramePr>
+            <a:graphic xmlns:a="http://schemas.openxmlformats.org/drawingml/2006/main">
+              <a:graphicData uri="http://schemas.openxmlformats.org/drawingml/2006/picture">
+                <pic:pic xmlns:pic="http://schemas.openxmlformats.org/drawingml/2006/picture">
+                  <pic:nvPicPr>
+                    <pic:cNvPr id="370018777" name=""/>
+                    <pic:cNvPicPr/>
+                  </pic:nvPicPr>
+                  <pic:blipFill>
+                    <a:blip r:embed="rId26"/>
+                    <a:stretch>
+                      <a:fillRect/>
+                    </a:stretch>
+                  </pic:blipFill>
+                  <pic:spPr>
+                    <a:xfrm>
+                      <a:off x="0" y="0"/>
+                      <a:ext cx="5940425" cy="2626995"/>
+                    </a:xfrm>
+                    <a:prstGeom prst="rect">
+                      <a:avLst/>
+                    </a:prstGeom>
+                  </pic:spPr>
+                </pic:pic>
+              </a:graphicData>
+            </a:graphic>
+          </wp:inline>
+        </w:drawing>
+      </w:r>
+    </w:p>
+    <w:p>
+      <w:pPr>
+        <w:pStyle w:val="a7"/>
+        <w:numPr>
+          <w:ilvl w:val="0"/>
+          <w:numId w:val="7"/>
+        </w:numPr>
+        <w:spacing w:line="240" w:lineRule="auto"/>
+        <w:rPr>
+          <w:rFonts w:ascii="Times New Roman" w:hAnsi="Times New Roman" w:cs="Times New Roman"/>
+          <w:bCs/>
+          <w:iCs/>
+          <w:color w:val="000000"/>
+          <w:sz w:val="24"/>
+          <w:szCs w:val="24"/>
+        </w:rPr>
+      </w:pPr>
+      <w:r>
+        <w:rPr>
+          <w:rFonts w:ascii="Times New Roman" w:hAnsi="Times New Roman" w:cs="Times New Roman"/>
+          <w:bCs/>
+          <w:iCs/>
+          <w:color w:val="000000"/>
+          <w:sz w:val="24"/>
+          <w:szCs w:val="24"/>
+        </w:rPr>
+        <w:lastRenderedPageBreak/>
+        <w:t xml:space="preserve">Завершил редактирование отчета по ЛР3, делаю </w:t>
+      </w:r>
+      <w:r>
+        <w:rPr>
+          <w:rFonts w:ascii="Times New Roman" w:hAnsi="Times New Roman" w:cs="Times New Roman"/>
+          <w:bCs/>
+          <w:iCs/>
+          <w:color w:val="000000"/>
+          <w:sz w:val="24"/>
+          <w:szCs w:val="24"/>
+          <w:lang w:val="en-US"/>
+        </w:rPr>
+        <w:t>commit</w:t>
+      </w:r>
+    </w:p>
+    <w:p>
+      <w:pPr>
+        <w:pStyle w:val="a7"/>
+        <w:spacing w:line="240" w:lineRule="auto"/>
+        <w:ind w:left="-207"/>
+        <w:rPr>
+          <w:rFonts w:ascii="Times New Roman" w:hAnsi="Times New Roman" w:cs="Times New Roman"/>
+          <w:bCs/>
+          <w:iCs/>
+          <w:color w:val="000000"/>
+          <w:sz w:val="24"/>
+          <w:szCs w:val="24"/>
+        </w:rPr>
+      </w:pPr>
+      <w:r>
+        <w:rPr>
+          <w:rFonts w:ascii="Times New Roman" w:hAnsi="Times New Roman" w:cs="Times New Roman"/>
+          <w:bCs/>
+          <w:iCs/>
+          <w:color w:val="000000"/>
+          <w:sz w:val="24"/>
+          <w:szCs w:val="24"/>
+          <w:lang w:val="en-US"/>
+        </w:rPr>
+        <w:drawing>
+          <wp:inline distT="0" distB="0" distL="0" distR="0" wp14:anchorId="29AEB3D5" wp14:editId="49866B87">
+            <wp:extent cx="5940425" cy="2626995"/>
+            <wp:effectExtent l="0" t="0" r="3175" b="1905"/>
+            <wp:docPr id="483710923" name="Рисунок 1"/>
+            <wp:cNvGraphicFramePr>
+              <a:graphicFrameLocks xmlns:a="http://schemas.openxmlformats.org/drawingml/2006/main" noChangeAspect="1"/>
+            </wp:cNvGraphicFramePr>
+            <a:graphic xmlns:a="http://schemas.openxmlformats.org/drawingml/2006/main">
+              <a:graphicData uri="http://schemas.openxmlformats.org/drawingml/2006/picture">
+                <pic:pic xmlns:pic="http://schemas.openxmlformats.org/drawingml/2006/picture">
+                  <pic:nvPicPr>
+                    <pic:cNvPr id="483710923" name=""/>
+                    <pic:cNvPicPr/>
+                  </pic:nvPicPr>
+                  <pic:blipFill>
+                    <a:blip r:embed="rId27"/>
+                    <a:stretch>
+                      <a:fillRect/>
+                    </a:stretch>
+                  </pic:blipFill>
+                  <pic:spPr>
+                    <a:xfrm>
+                      <a:off x="0" y="0"/>
+                      <a:ext cx="5940425" cy="2626995"/>
+                    </a:xfrm>
+                    <a:prstGeom prst="rect">
+                      <a:avLst/>
+                    </a:prstGeom>
+                  </pic:spPr>
+                </pic:pic>
+              </a:graphicData>
+            </a:graphic>
+          </wp:inline>
+        </w:drawing>
+      </w:r>
+    </w:p>
+    <w:p>
+      <w:pPr>
+        <w:pStyle w:val="a7"/>
+        <w:numPr>
+          <w:ilvl w:val="0"/>
+          <w:numId w:val="7"/>
+        </w:numPr>
+        <w:spacing w:line="240" w:lineRule="auto"/>
+        <w:rPr>
+          <w:rFonts w:ascii="Times New Roman" w:hAnsi="Times New Roman" w:cs="Times New Roman"/>
+          <w:bCs/>
+          <w:iCs/>
+          <w:color w:val="000000"/>
+          <w:sz w:val="24"/>
+          <w:szCs w:val="24"/>
+        </w:rPr>
+      </w:pPr>
+      <w:r>
+        <w:rPr>
+          <w:rFonts w:ascii="Times New Roman" w:hAnsi="Times New Roman" w:cs="Times New Roman"/>
+          <w:bCs/>
+          <w:iCs/>
+          <w:color w:val="000000"/>
+          <w:sz w:val="24"/>
+          <w:szCs w:val="24"/>
+        </w:rPr>
+        <w:t>•</w:t>
+      </w:r>
+      <w:r>
+        <w:rPr>
+          <w:rFonts w:ascii="Times New Roman" w:hAnsi="Times New Roman" w:cs="Times New Roman"/>
+          <w:bCs/>
+          <w:iCs/>
+          <w:color w:val="000000"/>
+          <w:sz w:val="24"/>
+          <w:szCs w:val="24"/>
+        </w:rPr>
+        <w:tab/>
+      </w:r>
+      <w:r>
+        <w:rPr>
+          <w:rFonts w:ascii="Times New Roman" w:hAnsi="Times New Roman" w:cs="Times New Roman"/>
+          <w:bCs/>
+          <w:iCs/>
+          <w:color w:val="000000"/>
+          <w:sz w:val="24"/>
+          <w:szCs w:val="24"/>
+        </w:rPr>
+        <w:t>О</w:t>
+      </w:r>
+      <w:r>
+        <w:rPr>
+          <w:rFonts w:ascii="Times New Roman" w:hAnsi="Times New Roman" w:cs="Times New Roman"/>
+          <w:bCs/>
+          <w:iCs/>
+          <w:color w:val="000000"/>
+          <w:sz w:val="24"/>
+          <w:szCs w:val="24"/>
+        </w:rPr>
+        <w:t>тправ</w:t>
+      </w:r>
+      <w:r>
+        <w:rPr>
+          <w:rFonts w:ascii="Times New Roman" w:hAnsi="Times New Roman" w:cs="Times New Roman"/>
+          <w:bCs/>
+          <w:iCs/>
+          <w:color w:val="000000"/>
+          <w:sz w:val="24"/>
+          <w:szCs w:val="24"/>
+        </w:rPr>
+        <w:t>ка</w:t>
+      </w:r>
+      <w:r>
+        <w:rPr>
+          <w:rFonts w:ascii="Times New Roman" w:hAnsi="Times New Roman" w:cs="Times New Roman"/>
+          <w:bCs/>
+          <w:iCs/>
+          <w:color w:val="000000"/>
+          <w:sz w:val="24"/>
+          <w:szCs w:val="24"/>
+        </w:rPr>
+        <w:t xml:space="preserve"> изменени</w:t>
+      </w:r>
+      <w:r>
+        <w:rPr>
+          <w:rFonts w:ascii="Times New Roman" w:hAnsi="Times New Roman" w:cs="Times New Roman"/>
+          <w:bCs/>
+          <w:iCs/>
+          <w:color w:val="000000"/>
+          <w:sz w:val="24"/>
+          <w:szCs w:val="24"/>
+        </w:rPr>
+        <w:t>я</w:t>
+      </w:r>
+      <w:r>
+        <w:rPr>
+          <w:rFonts w:ascii="Times New Roman" w:hAnsi="Times New Roman" w:cs="Times New Roman"/>
+          <w:bCs/>
+          <w:iCs/>
+          <w:color w:val="000000"/>
+          <w:sz w:val="24"/>
+          <w:szCs w:val="24"/>
+        </w:rPr>
+        <w:t xml:space="preserve"> в удалённый репозиторий</w:t>
+      </w:r>
+      <w:r>
+        <w:rPr>
+          <w:rFonts w:ascii="Times New Roman" w:hAnsi="Times New Roman" w:cs="Times New Roman"/>
+          <w:bCs/>
+          <w:iCs/>
+          <w:color w:val="000000"/>
+          <w:sz w:val="24"/>
+          <w:szCs w:val="24"/>
+        </w:rPr>
+        <w:t>;</w:t>
+      </w:r>
+    </w:p>
+    <w:p>
+      <w:pPr>
+        <w:pStyle w:val="a7"/>
+        <w:numPr>
+          <w:ilvl w:val="0"/>
+          <w:numId w:val="7"/>
+        </w:numPr>
+        <w:spacing w:line="240" w:lineRule="auto"/>
+        <w:rPr>
+          <w:rFonts w:ascii="Times New Roman" w:hAnsi="Times New Roman" w:cs="Times New Roman"/>
+          <w:bCs/>
+          <w:iCs/>
+          <w:color w:val="000000"/>
+          <w:sz w:val="24"/>
+          <w:szCs w:val="24"/>
+        </w:rPr>
+      </w:pPr>
+      <w:r>
+        <w:rPr>
+          <w:rFonts w:ascii="Times New Roman" w:hAnsi="Times New Roman" w:cs="Times New Roman"/>
+          <w:bCs/>
+          <w:iCs/>
+          <w:color w:val="000000"/>
+          <w:sz w:val="24"/>
+          <w:szCs w:val="24"/>
+        </w:rPr>
+        <w:t xml:space="preserve">Создание Pull </w:t>
+      </w:r>
+      <w:proofErr w:type="spellStart"/>
+      <w:r>
+        <w:rPr>
+          <w:rFonts w:ascii="Times New Roman" w:hAnsi="Times New Roman" w:cs="Times New Roman"/>
+          <w:bCs/>
+          <w:iCs/>
+          <w:color w:val="000000"/>
+          <w:sz w:val="24"/>
+          <w:szCs w:val="24"/>
+        </w:rPr>
+        <w:t>Request</w:t>
+      </w:r>
+      <w:proofErr w:type="spellEnd"/>
+      <w:r>
+        <w:rPr>
+          <w:rFonts w:ascii="Times New Roman" w:hAnsi="Times New Roman" w:cs="Times New Roman"/>
+          <w:bCs/>
+          <w:iCs/>
+          <w:color w:val="000000"/>
+          <w:sz w:val="24"/>
+          <w:szCs w:val="24"/>
+        </w:rPr>
+        <w:t>.</w:t>
+      </w:r>
+    </w:p>
+    <w:p>
+      <w:pPr>
         <w:spacing w:line="240" w:lineRule="auto"/>
         <w:ind w:left="-567"/>
         <w:rPr>
@@ -1548,77 +3977,66 @@
         <w:jc w:val="both"/>
         <w:rPr>
           <w:rFonts w:ascii="Times New Roman" w:hAnsi="Times New Roman" w:cs="Times New Roman"/>
-          <w:color w:val="000000"/>
-          <w:sz w:val="24"/>
-          <w:szCs w:val="24"/>
-        </w:rPr>
-      </w:pPr>
-      <w:r>
-        <w:rPr>
-          <w:rFonts w:ascii="Times New Roman" w:hAnsi="Times New Roman" w:cs="Times New Roman"/>
-          <w:color w:val="000000"/>
-          <w:sz w:val="24"/>
-          <w:szCs w:val="24"/>
-        </w:rPr>
-        <w:t xml:space="preserve">В этой лабораторной работе мы научились проектировать и создавать веб-сайты при помощи </w:t>
-      </w:r>
-      <w:r>
-        <w:rPr>
-          <w:rFonts w:ascii="Times New Roman" w:hAnsi="Times New Roman" w:cs="Times New Roman"/>
-          <w:color w:val="000000"/>
-          <w:sz w:val="24"/>
-          <w:szCs w:val="24"/>
-          <w:lang w:val="en-US"/>
-        </w:rPr>
-        <w:t>HTML</w:t>
-      </w:r>
-      <w:r>
-        <w:rPr>
-          <w:rFonts w:ascii="Times New Roman" w:hAnsi="Times New Roman" w:cs="Times New Roman"/>
-          <w:color w:val="000000"/>
-          <w:sz w:val="24"/>
-          <w:szCs w:val="24"/>
-        </w:rPr>
-        <w:t xml:space="preserve">, </w:t>
-      </w:r>
-      <w:r>
-        <w:rPr>
-          <w:rFonts w:ascii="Times New Roman" w:hAnsi="Times New Roman" w:cs="Times New Roman"/>
-          <w:color w:val="000000"/>
-          <w:sz w:val="24"/>
-          <w:szCs w:val="24"/>
-          <w:lang w:val="en-US"/>
-        </w:rPr>
-        <w:t>CSS</w:t>
-      </w:r>
-      <w:r>
-        <w:rPr>
-          <w:rFonts w:ascii="Times New Roman" w:hAnsi="Times New Roman" w:cs="Times New Roman"/>
-          <w:color w:val="000000"/>
-          <w:sz w:val="24"/>
-          <w:szCs w:val="24"/>
-        </w:rPr>
-        <w:t xml:space="preserve"> </w:t>
-      </w:r>
-      <w:r>
-        <w:rPr>
-          <w:rFonts w:ascii="Times New Roman" w:hAnsi="Times New Roman" w:cs="Times New Roman"/>
-          <w:color w:val="000000"/>
-          <w:sz w:val="24"/>
-          <w:szCs w:val="24"/>
-        </w:rPr>
-        <w:t xml:space="preserve">и </w:t>
-      </w:r>
-      <w:r>
-        <w:rPr>
-          <w:rFonts w:ascii="Times New Roman" w:hAnsi="Times New Roman" w:cs="Times New Roman"/>
-          <w:color w:val="000000"/>
-          <w:sz w:val="24"/>
-          <w:szCs w:val="24"/>
-          <w:lang w:val="en-US"/>
-        </w:rPr>
-        <w:t>JS</w:t>
-      </w:r>
+          <w:sz w:val="24"/>
+          <w:szCs w:val="24"/>
+        </w:rPr>
+      </w:pPr>
+      <w:r>
+        <w:rPr>
+          <w:rFonts w:ascii="Times New Roman" w:hAnsi="Times New Roman" w:cs="Times New Roman"/>
+          <w:color w:val="000000"/>
+          <w:sz w:val="24"/>
+          <w:szCs w:val="24"/>
+        </w:rPr>
+        <w:t xml:space="preserve">В этой лабораторной работе мы </w:t>
+      </w:r>
+      <w:r>
+        <w:rPr>
+          <w:rFonts w:ascii="Times New Roman" w:hAnsi="Times New Roman" w:cs="Times New Roman"/>
+          <w:color w:val="000000"/>
+          <w:sz w:val="24"/>
+          <w:szCs w:val="24"/>
+        </w:rPr>
+        <w:t>поз</w:t>
+      </w:r>
+      <w:r>
+        <w:rPr>
+          <w:rFonts w:ascii="Times New Roman" w:hAnsi="Times New Roman" w:cs="Times New Roman"/>
+          <w:color w:val="000000"/>
+          <w:sz w:val="24"/>
+          <w:szCs w:val="24"/>
+        </w:rPr>
+        <w:t>наком</w:t>
+      </w:r>
+      <w:r>
+        <w:rPr>
+          <w:rFonts w:ascii="Times New Roman" w:hAnsi="Times New Roman" w:cs="Times New Roman"/>
+          <w:color w:val="000000"/>
+          <w:sz w:val="24"/>
+          <w:szCs w:val="24"/>
+        </w:rPr>
+        <w:t>ились</w:t>
+      </w:r>
+      <w:r>
+        <w:rPr>
+          <w:rFonts w:ascii="Times New Roman" w:hAnsi="Times New Roman" w:cs="Times New Roman"/>
+          <w:color w:val="000000"/>
+          <w:sz w:val="24"/>
+          <w:szCs w:val="24"/>
+        </w:rPr>
+        <w:t xml:space="preserve"> с системой контроля версий </w:t>
+      </w:r>
+      <w:proofErr w:type="spellStart"/>
+      <w:r>
+        <w:rPr>
+          <w:rFonts w:ascii="Times New Roman" w:hAnsi="Times New Roman" w:cs="Times New Roman"/>
+          <w:color w:val="000000"/>
+          <w:sz w:val="24"/>
+          <w:szCs w:val="24"/>
+        </w:rPr>
+        <w:t>git</w:t>
+      </w:r>
+      <w:proofErr w:type="spellEnd"/>
       <w:r>
         <w:rPr>
           <w:rFonts w:ascii="Times New Roman" w:hAnsi="Times New Roman" w:cs="Times New Roman"/>
@@ -1629,20 +4047,9 @@
         <w:t>.</w:t>
       </w:r>
     </w:p>
-    <w:p>
-      <w:pPr>
-        <w:spacing w:after="160" w:line="259" w:lineRule="auto"/>
-        <w:rPr>
-          <w:rFonts w:ascii="Times New Roman" w:hAnsi="Times New Roman" w:cs="Times New Roman"/>
-          <w:sz w:val="24"/>
-          <w:szCs w:val="24"/>
-          <w:lang w:val="en-US"/>
-        </w:rPr>
-      </w:pPr>
-    </w:p>
     <w:sectPr>
-      <w:footerReference w:type="default" r:id="rId12"/>
-      <w:footerReference w:type="first" r:id="rId13"/>
+      <w:footerReference w:type="default" r:id="rId28"/>
+      <w:footerReference w:type="first" r:id="rId29"/>
       <w:pgSz w:w="11906" w:h="16838"/>
       <w:pgMar w:top="1134" w:right="850" w:bottom="1134" w:left="1701" w:header="708" w:footer="708" w:gutter="0"/>
       <w:cols w:space="708"/>

</xml_diff>